<commit_message>
The start of lab 8
</commit_message>
<xml_diff>
--- a/Lab 5/Forces and Vectors (DROPBOX).docx
+++ b/Lab 5/Forces and Vectors (DROPBOX).docx
@@ -122,38 +122,19 @@
           <w:bCs/>
           <w:iCs/>
         </w:rPr>
-        <w:t xml:space="preserve">Sep </w:t>
-      </w:r>
-      <w:r>
-        <w:rPr>
-          <w:bCs/>
-          <w:iCs/>
-        </w:rPr>
-        <w:t>23</w:t>
-      </w:r>
-      <w:r>
-        <w:rPr>
-          <w:bCs/>
-          <w:iCs/>
-        </w:rPr>
-        <w:t xml:space="preserve">, 2026 (Sep </w:t>
-      </w:r>
-      <w:r>
-        <w:rPr>
-          <w:bCs/>
-          <w:iCs/>
-        </w:rPr>
-        <w:t>30</w:t>
-      </w:r>
-      <w:r>
-        <w:rPr>
-          <w:bCs/>
-          <w:iCs/>
-        </w:rPr>
-        <w:t>, 2026)</w:t>
+        <w:t>Sep 23, 2026</w:t>
       </w:r>
     </w:p>
     <w:bookmarkEnd w:id="0"/>
+    <w:p>
+      <w:pPr>
+        <w:spacing w:after="160" w:line="259" w:lineRule="auto"/>
+        <w:rPr>
+          <w:b/>
+          <w:i/>
+        </w:rPr>
+      </w:pPr>
+    </w:p>
     <w:p>
       <w:pPr>
         <w:spacing w:after="160" w:line="259" w:lineRule="auto"/>
@@ -332,12 +313,12 @@
     <w:p/>
     <w:tbl>
       <w:tblPr>
-        <w:tblW w:w="7195" w:type="dxa"/>
+        <w:tblW w:w="8005" w:type="dxa"/>
         <w:tblLook w:val="04A0" w:firstRow="1" w:lastRow="0" w:firstColumn="1" w:lastColumn="0" w:noHBand="0" w:noVBand="1"/>
       </w:tblPr>
       <w:tblGrid>
         <w:gridCol w:w="2280"/>
-        <w:gridCol w:w="2485"/>
+        <w:gridCol w:w="3295"/>
         <w:gridCol w:w="2430"/>
       </w:tblGrid>
       <w:tr>
@@ -376,7 +357,7 @@
         </w:tc>
         <w:tc>
           <w:tcPr>
-            <w:tcW w:w="2485" w:type="dxa"/>
+            <w:tcW w:w="3295" w:type="dxa"/>
             <w:tcBorders>
               <w:top w:val="single" w:sz="4" w:space="0" w:color="auto"/>
               <w:left w:val="nil"/>
@@ -407,7 +388,21 @@
                 <w:sz w:val="28"/>
                 <w:szCs w:val="28"/>
               </w:rPr>
-              <w:t xml:space="preserve"> (g)</w:t>
+              <w:t xml:space="preserve"> (</w:t>
+            </w:r>
+            <w:r>
+              <w:rPr>
+                <w:sz w:val="28"/>
+                <w:szCs w:val="28"/>
+              </w:rPr>
+              <w:t>N</w:t>
+            </w:r>
+            <w:r>
+              <w:rPr>
+                <w:sz w:val="28"/>
+                <w:szCs w:val="28"/>
+              </w:rPr>
+              <w:t>)</w:t>
             </w:r>
           </w:p>
         </w:tc>
@@ -517,7 +512,7 @@
         </w:tc>
         <w:tc>
           <w:tcPr>
-            <w:tcW w:w="2485" w:type="dxa"/>
+            <w:tcW w:w="3295" w:type="dxa"/>
             <w:tcBorders>
               <w:top w:val="nil"/>
               <w:left w:val="nil"/>
@@ -554,7 +549,7 @@
                     <w:sz w:val="28"/>
                     <w:szCs w:val="28"/>
                   </w:rPr>
-                  <m:t xml:space="preserve">248±30N </m:t>
+                  <m:t xml:space="preserve">2.39±0.294N </m:t>
                 </m:r>
                 <m:d>
                   <m:dPr>
@@ -571,6 +566,12 @@
                   </m:dPr>
                   <m:e>
                     <m:r>
+                      <w:rPr>
+                        <w:rFonts w:ascii="Cambria Math" w:hAnsi="Cambria Math"/>
+                      </w:rPr>
+                      <m:t>2.48</m:t>
+                    </m:r>
+                    <m:r>
                       <m:rPr>
                         <m:sty m:val="p"/>
                       </m:rPr>
@@ -581,7 +582,7 @@
                         <w:sz w:val="28"/>
                         <w:szCs w:val="28"/>
                       </w:rPr>
-                      <m:t>.80%</m:t>
+                      <m:t>%</m:t>
                     </m:r>
                   </m:e>
                 </m:d>
@@ -631,7 +632,7 @@
                     <w:sz w:val="28"/>
                     <w:szCs w:val="28"/>
                   </w:rPr>
-                  <m:t>230°±4°</m:t>
+                  <m:t>235°±4°</m:t>
                 </m:r>
               </m:oMath>
             </m:oMathPara>
@@ -829,17 +830,29 @@
         <w:t xml:space="preserve">, on the figures below to include their components. Depict only one vector on each figure. </w:t>
       </w:r>
     </w:p>
-    <w:p/>
     <w:p>
-      <w:r>
+      <w:pPr>
         <w:rPr>
           <w:noProof/>
           <w14:ligatures w14:val="standardContextual"/>
         </w:rPr>
+      </w:pPr>
+      <w:r>
+        <w:rPr>
+          <w:noProof/>
+          <w14:ligatures w14:val="standardContextual"/>
+        </w:rPr>
+        <w:t xml:space="preserve"> </w:t>
+      </w:r>
+      <w:r>
+        <w:rPr>
+          <w:noProof/>
+          <w14:ligatures w14:val="standardContextual"/>
+        </w:rPr>
         <w:drawing>
-          <wp:inline distT="0" distB="0" distL="0" distR="0" wp14:anchorId="2EDBD1DE" wp14:editId="5A4EC974">
-            <wp:extent cx="2861509" cy="3165857"/>
-            <wp:effectExtent l="0" t="0" r="15240" b="15875"/>
+          <wp:inline distT="0" distB="0" distL="0" distR="0" wp14:anchorId="1819D521" wp14:editId="32121261">
+            <wp:extent cx="2852979" cy="3170731"/>
+            <wp:effectExtent l="0" t="0" r="5080" b="10795"/>
             <wp:docPr id="1" name="Chart 1">
               <a:extLst xmlns:a="http://schemas.openxmlformats.org/drawingml/2006/main">
                 <a:ext uri="{FF2B5EF4-FFF2-40B4-BE49-F238E27FC236}">
@@ -862,10 +875,10 @@
           <w14:ligatures w14:val="standardContextual"/>
         </w:rPr>
         <w:drawing>
-          <wp:inline distT="0" distB="0" distL="0" distR="0" wp14:anchorId="733ED558" wp14:editId="05BCDA92">
-            <wp:extent cx="2852329" cy="3156857"/>
-            <wp:effectExtent l="0" t="0" r="5715" b="5715"/>
-            <wp:docPr id="5" name="Chart 5">
+          <wp:inline distT="0" distB="0" distL="0" distR="0" wp14:anchorId="10447836" wp14:editId="2DC464BE">
+            <wp:extent cx="2838248" cy="3161731"/>
+            <wp:effectExtent l="0" t="0" r="635" b="635"/>
+            <wp:docPr id="2" name="Chart 2">
               <a:extLst xmlns:a="http://schemas.openxmlformats.org/drawingml/2006/main">
                 <a:ext uri="{FF2B5EF4-FFF2-40B4-BE49-F238E27FC236}">
                   <a16:creationId xmlns:a16="http://schemas.microsoft.com/office/drawing/2014/main" id="{00000000-0008-0000-0000-000002000000}"/>
@@ -890,10 +903,10 @@
         </w:rPr>
         <w:lastRenderedPageBreak/>
         <w:drawing>
-          <wp:inline distT="0" distB="0" distL="0" distR="0" wp14:anchorId="29968C0F" wp14:editId="2D5D2211">
-            <wp:extent cx="2987566" cy="3160986"/>
-            <wp:effectExtent l="0" t="0" r="3810" b="1905"/>
-            <wp:docPr id="12" name="Chart 12">
+          <wp:inline distT="0" distB="0" distL="0" distR="0" wp14:anchorId="6F4B400E" wp14:editId="34E53D91">
+            <wp:extent cx="3039818" cy="3161731"/>
+            <wp:effectExtent l="0" t="0" r="8255" b="635"/>
+            <wp:docPr id="3" name="Chart 3">
               <a:extLst xmlns:a="http://schemas.openxmlformats.org/drawingml/2006/main">
                 <a:ext uri="{FF2B5EF4-FFF2-40B4-BE49-F238E27FC236}">
                   <a16:creationId xmlns:a16="http://schemas.microsoft.com/office/drawing/2014/main" id="{00000000-0008-0000-0000-000003000000}"/>
@@ -914,18 +927,11 @@
           <w:noProof/>
           <w14:ligatures w14:val="standardContextual"/>
         </w:rPr>
-        <w:t xml:space="preserve"> </w:t>
-      </w:r>
-      <w:r>
-        <w:rPr>
-          <w:noProof/>
-          <w14:ligatures w14:val="standardContextual"/>
-        </w:rPr>
         <w:drawing>
-          <wp:inline distT="0" distB="0" distL="0" distR="0" wp14:anchorId="4F1E4E7C" wp14:editId="3919C9BD">
-            <wp:extent cx="2897269" cy="3165280"/>
-            <wp:effectExtent l="0" t="0" r="17780" b="16510"/>
-            <wp:docPr id="11" name="Chart 11">
+          <wp:inline distT="0" distB="0" distL="0" distR="0" wp14:anchorId="4E9CDD1B" wp14:editId="72DB2BCC">
+            <wp:extent cx="2883188" cy="3174758"/>
+            <wp:effectExtent l="0" t="0" r="12700" b="6985"/>
+            <wp:docPr id="4" name="Chart 4">
               <a:extLst xmlns:a="http://schemas.openxmlformats.org/drawingml/2006/main">
                 <a:ext uri="{FF2B5EF4-FFF2-40B4-BE49-F238E27FC236}">
                   <a16:creationId xmlns:a16="http://schemas.microsoft.com/office/drawing/2014/main" id="{00000000-0008-0000-0000-000005000000}"/>
@@ -1995,7 +2001,7 @@
       </w:tblGrid>
       <w:tr>
         <w:trPr>
-          <w:trHeight w:val="348"/>
+          <w:trHeight w:val="360"/>
         </w:trPr>
         <w:tc>
           <w:tcPr>
@@ -2017,16 +2023,16 @@
               <w:rPr>
                 <w:b/>
                 <w:bCs/>
-                <w:i/>
-                <w:iCs/>
+                <w:sz w:val="28"/>
+                <w:szCs w:val="28"/>
               </w:rPr>
             </w:pPr>
             <w:r>
               <w:rPr>
                 <w:b/>
                 <w:bCs/>
-                <w:i/>
-                <w:iCs/>
+                <w:sz w:val="28"/>
+                <w:szCs w:val="28"/>
               </w:rPr>
               <w:t>Force</w:t>
             </w:r>
@@ -2052,12 +2058,16 @@
               <w:rPr>
                 <w:b/>
                 <w:bCs/>
+                <w:sz w:val="28"/>
+                <w:szCs w:val="28"/>
               </w:rPr>
             </w:pPr>
             <w:r>
               <w:rPr>
                 <w:b/>
                 <w:bCs/>
+                <w:sz w:val="28"/>
+                <w:szCs w:val="28"/>
               </w:rPr>
               <w:t>Magnitude</w:t>
             </w:r>
@@ -2065,8 +2075,10 @@
               <w:rPr>
                 <w:b/>
                 <w:bCs/>
-              </w:rPr>
-              <w:t xml:space="preserve"> (g)</w:t>
+                <w:sz w:val="28"/>
+                <w:szCs w:val="28"/>
+              </w:rPr>
+              <w:t xml:space="preserve"> (N)</w:t>
             </w:r>
           </w:p>
         </w:tc>
@@ -2090,21 +2102,18 @@
               <w:rPr>
                 <w:b/>
                 <w:bCs/>
+                <w:sz w:val="28"/>
+                <w:szCs w:val="28"/>
               </w:rPr>
             </w:pPr>
             <w:r>
               <w:rPr>
                 <w:b/>
                 <w:bCs/>
+                <w:sz w:val="28"/>
+                <w:szCs w:val="28"/>
               </w:rPr>
               <w:t>Direction</w:t>
-            </w:r>
-            <w:r>
-              <w:rPr>
-                <w:b/>
-                <w:bCs/>
-              </w:rPr>
-              <w:t xml:space="preserve"> (degree)</w:t>
             </w:r>
           </w:p>
         </w:tc>
@@ -2128,14 +2137,27 @@
               <w:rPr>
                 <w:b/>
                 <w:bCs/>
+                <w:sz w:val="28"/>
+                <w:szCs w:val="28"/>
               </w:rPr>
             </w:pPr>
             <w:r>
               <w:rPr>
                 <w:b/>
                 <w:bCs/>
+                <w:sz w:val="28"/>
+                <w:szCs w:val="28"/>
               </w:rPr>
               <w:t>x-component</w:t>
+            </w:r>
+            <w:r>
+              <w:rPr>
+                <w:b/>
+                <w:bCs/>
+                <w:sz w:val="28"/>
+                <w:szCs w:val="28"/>
+              </w:rPr>
+              <w:t xml:space="preserve"> (N)</w:t>
             </w:r>
           </w:p>
         </w:tc>
@@ -2159,21 +2181,34 @@
               <w:rPr>
                 <w:b/>
                 <w:bCs/>
+                <w:sz w:val="28"/>
+                <w:szCs w:val="28"/>
               </w:rPr>
             </w:pPr>
             <w:r>
               <w:rPr>
                 <w:b/>
                 <w:bCs/>
+                <w:sz w:val="28"/>
+                <w:szCs w:val="28"/>
               </w:rPr>
               <w:t>y-component</w:t>
+            </w:r>
+            <w:r>
+              <w:rPr>
+                <w:b/>
+                <w:bCs/>
+                <w:sz w:val="28"/>
+                <w:szCs w:val="28"/>
+              </w:rPr>
+              <w:t xml:space="preserve"> (N)</w:t>
             </w:r>
           </w:p>
         </w:tc>
       </w:tr>
       <w:tr>
         <w:trPr>
-          <w:trHeight w:val="348"/>
+          <w:trHeight w:val="360"/>
         </w:trPr>
         <w:tc>
           <w:tcPr>
@@ -2195,12 +2230,16 @@
               <w:rPr>
                 <w:b/>
                 <w:bCs/>
+                <w:sz w:val="28"/>
+                <w:szCs w:val="28"/>
               </w:rPr>
             </w:pPr>
             <w:r>
               <w:rPr>
                 <w:b/>
                 <w:bCs/>
+                <w:sz w:val="28"/>
+                <w:szCs w:val="28"/>
               </w:rPr>
               <w:t>A</w:t>
             </w:r>
@@ -2215,7 +2254,7 @@
               <w:bottom w:val="single" w:sz="4" w:space="0" w:color="auto"/>
               <w:right w:val="single" w:sz="4" w:space="0" w:color="auto"/>
             </w:tcBorders>
-            <w:shd w:val="clear" w:color="auto" w:fill="FFFFFF" w:themeFill="background1"/>
+            <w:shd w:val="clear" w:color="FFFF00" w:fill="FFFFFF"/>
             <w:noWrap/>
             <w:vAlign w:val="bottom"/>
             <w:hideMark/>
@@ -2233,7 +2272,7 @@
                 <w:sz w:val="28"/>
                 <w:szCs w:val="28"/>
               </w:rPr>
-              <w:t>150.00</w:t>
+              <w:t>1.47</w:t>
             </w:r>
           </w:p>
         </w:tc>
@@ -2246,7 +2285,7 @@
               <w:bottom w:val="single" w:sz="4" w:space="0" w:color="auto"/>
               <w:right w:val="single" w:sz="4" w:space="0" w:color="auto"/>
             </w:tcBorders>
-            <w:shd w:val="clear" w:color="auto" w:fill="FFFFFF" w:themeFill="background1"/>
+            <w:shd w:val="clear" w:color="FFFF00" w:fill="FFFFFF"/>
             <w:noWrap/>
             <w:vAlign w:val="bottom"/>
             <w:hideMark/>
@@ -2295,7 +2334,7 @@
                 <w:sz w:val="28"/>
                 <w:szCs w:val="28"/>
               </w:rPr>
-              <w:t>150.00</w:t>
+              <w:t>1.47</w:t>
             </w:r>
           </w:p>
         </w:tc>
@@ -2333,7 +2372,7 @@
       </w:tr>
       <w:tr>
         <w:trPr>
-          <w:trHeight w:val="348"/>
+          <w:trHeight w:val="360"/>
         </w:trPr>
         <w:tc>
           <w:tcPr>
@@ -2355,12 +2394,16 @@
               <w:rPr>
                 <w:b/>
                 <w:bCs/>
+                <w:sz w:val="28"/>
+                <w:szCs w:val="28"/>
               </w:rPr>
             </w:pPr>
             <w:r>
               <w:rPr>
                 <w:b/>
                 <w:bCs/>
+                <w:sz w:val="28"/>
+                <w:szCs w:val="28"/>
               </w:rPr>
               <w:t>B</w:t>
             </w:r>
@@ -2375,7 +2418,7 @@
               <w:bottom w:val="single" w:sz="4" w:space="0" w:color="auto"/>
               <w:right w:val="single" w:sz="4" w:space="0" w:color="auto"/>
             </w:tcBorders>
-            <w:shd w:val="clear" w:color="auto" w:fill="FFFFFF" w:themeFill="background1"/>
+            <w:shd w:val="clear" w:color="FFFF00" w:fill="FFFFFF"/>
             <w:noWrap/>
             <w:vAlign w:val="bottom"/>
             <w:hideMark/>
@@ -2393,7 +2436,7 @@
                 <w:sz w:val="28"/>
                 <w:szCs w:val="28"/>
               </w:rPr>
-              <w:t>200.00</w:t>
+              <w:t>1.96</w:t>
             </w:r>
           </w:p>
         </w:tc>
@@ -2406,7 +2449,7 @@
               <w:bottom w:val="single" w:sz="4" w:space="0" w:color="auto"/>
               <w:right w:val="single" w:sz="4" w:space="0" w:color="auto"/>
             </w:tcBorders>
-            <w:shd w:val="clear" w:color="auto" w:fill="FFFFFF" w:themeFill="background1"/>
+            <w:shd w:val="clear" w:color="FFFF00" w:fill="FFFFFF"/>
             <w:noWrap/>
             <w:vAlign w:val="bottom"/>
             <w:hideMark/>
@@ -2486,14 +2529,14 @@
                 <w:sz w:val="28"/>
                 <w:szCs w:val="28"/>
               </w:rPr>
-              <w:t>200.00</w:t>
+              <w:t>1.96</w:t>
             </w:r>
           </w:p>
         </w:tc>
       </w:tr>
       <w:tr>
         <w:trPr>
-          <w:trHeight w:val="348"/>
+          <w:trHeight w:val="360"/>
         </w:trPr>
         <w:tc>
           <w:tcPr>
@@ -2515,12 +2558,16 @@
               <w:rPr>
                 <w:b/>
                 <w:bCs/>
+                <w:sz w:val="28"/>
+                <w:szCs w:val="28"/>
               </w:rPr>
             </w:pPr>
             <w:r>
               <w:rPr>
                 <w:b/>
                 <w:bCs/>
+                <w:sz w:val="28"/>
+                <w:szCs w:val="28"/>
               </w:rPr>
               <w:t>C-Cal=</w:t>
             </w:r>
@@ -2553,7 +2600,7 @@
                 <w:sz w:val="28"/>
                 <w:szCs w:val="28"/>
               </w:rPr>
-              <w:t>250.00</w:t>
+              <w:t>2.45</w:t>
             </w:r>
           </w:p>
         </w:tc>
@@ -2615,7 +2662,7 @@
                 <w:sz w:val="28"/>
                 <w:szCs w:val="28"/>
               </w:rPr>
-              <w:t>-150.00</w:t>
+              <w:t>-1.47</w:t>
             </w:r>
           </w:p>
         </w:tc>
@@ -2646,14 +2693,14 @@
                 <w:sz w:val="28"/>
                 <w:szCs w:val="28"/>
               </w:rPr>
-              <w:t>-200.00</w:t>
+              <w:t>-1.96</w:t>
             </w:r>
           </w:p>
         </w:tc>
       </w:tr>
       <w:tr>
         <w:trPr>
-          <w:trHeight w:val="348"/>
+          <w:trHeight w:val="360"/>
         </w:trPr>
         <w:tc>
           <w:tcPr>
@@ -2675,12 +2722,16 @@
               <w:rPr>
                 <w:b/>
                 <w:bCs/>
+                <w:sz w:val="28"/>
+                <w:szCs w:val="28"/>
               </w:rPr>
             </w:pPr>
             <w:r>
               <w:rPr>
                 <w:b/>
                 <w:bCs/>
+                <w:sz w:val="28"/>
+                <w:szCs w:val="28"/>
               </w:rPr>
               <w:t>C-exp=</w:t>
             </w:r>
@@ -2695,7 +2746,7 @@
               <w:bottom w:val="single" w:sz="4" w:space="0" w:color="auto"/>
               <w:right w:val="single" w:sz="4" w:space="0" w:color="auto"/>
             </w:tcBorders>
-            <w:shd w:val="clear" w:color="auto" w:fill="FFFFFF" w:themeFill="background1"/>
+            <w:shd w:val="clear" w:color="FFFF00" w:fill="FFFFFF"/>
             <w:noWrap/>
             <w:vAlign w:val="bottom"/>
             <w:hideMark/>
@@ -2713,7 +2764,7 @@
                 <w:sz w:val="28"/>
                 <w:szCs w:val="28"/>
               </w:rPr>
-              <w:t>248.00</w:t>
+              <w:t>2.39</w:t>
             </w:r>
           </w:p>
         </w:tc>
@@ -2726,7 +2777,7 @@
               <w:bottom w:val="single" w:sz="4" w:space="0" w:color="auto"/>
               <w:right w:val="single" w:sz="4" w:space="0" w:color="auto"/>
             </w:tcBorders>
-            <w:shd w:val="clear" w:color="auto" w:fill="FFFFFF" w:themeFill="background1"/>
+            <w:shd w:val="clear" w:color="FFFF00" w:fill="FFFFFF"/>
             <w:noWrap/>
             <w:vAlign w:val="bottom"/>
             <w:hideMark/>
@@ -2744,7 +2795,7 @@
                 <w:sz w:val="28"/>
                 <w:szCs w:val="28"/>
               </w:rPr>
-              <w:t>230.00</w:t>
+              <w:t>235.00</w:t>
             </w:r>
           </w:p>
         </w:tc>
@@ -2806,7 +2857,7 @@
       </w:tr>
       <w:tr>
         <w:trPr>
-          <w:trHeight w:val="348"/>
+          <w:trHeight w:val="360"/>
         </w:trPr>
         <w:tc>
           <w:tcPr>
@@ -2828,12 +2879,16 @@
               <w:rPr>
                 <w:b/>
                 <w:bCs/>
+                <w:sz w:val="28"/>
+                <w:szCs w:val="28"/>
               </w:rPr>
             </w:pPr>
             <w:r>
               <w:rPr>
                 <w:b/>
                 <w:bCs/>
+                <w:sz w:val="28"/>
+                <w:szCs w:val="28"/>
               </w:rPr>
               <w:t>Diff=</w:t>
             </w:r>
@@ -2866,7 +2921,7 @@
                 <w:sz w:val="28"/>
                 <w:szCs w:val="28"/>
               </w:rPr>
-              <w:t>2.00</w:t>
+              <w:t>0.06</w:t>
             </w:r>
           </w:p>
         </w:tc>
@@ -2897,7 +2952,7 @@
                 <w:sz w:val="28"/>
                 <w:szCs w:val="28"/>
               </w:rPr>
-              <w:t>3.13</w:t>
+              <w:t>-1.87</w:t>
             </w:r>
           </w:p>
         </w:tc>
@@ -2959,7 +3014,7 @@
       </w:tr>
       <w:tr>
         <w:trPr>
-          <w:trHeight w:val="348"/>
+          <w:trHeight w:val="360"/>
         </w:trPr>
         <w:tc>
           <w:tcPr>
@@ -2981,12 +3036,16 @@
               <w:rPr>
                 <w:b/>
                 <w:bCs/>
+                <w:sz w:val="28"/>
+                <w:szCs w:val="28"/>
               </w:rPr>
             </w:pPr>
             <w:r>
               <w:rPr>
                 <w:b/>
                 <w:bCs/>
+                <w:sz w:val="28"/>
+                <w:szCs w:val="28"/>
               </w:rPr>
               <w:t>% Diff=</w:t>
             </w:r>
@@ -3019,7 +3078,7 @@
                 <w:sz w:val="28"/>
                 <w:szCs w:val="28"/>
               </w:rPr>
-              <w:t>.80</w:t>
+              <w:t>2.48</w:t>
             </w:r>
           </w:p>
         </w:tc>
@@ -3238,27 +3297,126 @@
       <w:pPr>
         <w:pStyle w:val="NormalWeb"/>
         <w:spacing w:before="0" w:beforeAutospacing="0" w:after="0" w:afterAutospacing="0"/>
-        <w:rPr>
-          <w:rFonts w:eastAsiaTheme="minorEastAsia"/>
-          <w:color w:val="000000" w:themeColor="text1"/>
-          <w:kern w:val="24"/>
-        </w:rPr>
       </w:pPr>
+      <w:r>
+        <w:rPr>
+          <w:u w:val="single"/>
+        </w:rPr>
+        <w:t>Force A</w:t>
+      </w:r>
+      <w:r>
+        <w:t xml:space="preserve"> (</w:t>
+      </w:r>
+      <w:r>
+        <w:t>With 150g</w:t>
+      </w:r>
+      <w:r>
+        <w:t>)</w:t>
+      </w:r>
+      <w:r>
+        <w:t>:</w:t>
+      </w:r>
+      <w:r>
+        <w:t xml:space="preserve"> </w:t>
+      </w:r>
     </w:p>
     <w:p>
       <w:pPr>
         <w:pStyle w:val="NormalWeb"/>
         <w:spacing w:before="0" w:beforeAutospacing="0" w:after="0" w:afterAutospacing="0"/>
+        <w:rPr>
+          <w:iCs/>
+        </w:rPr>
       </w:pPr>
-      <w:r>
-        <w:rPr>
-          <w:u w:val="single"/>
-        </w:rPr>
-        <w:t>Force A</w:t>
-      </w:r>
-      <w:r>
-        <w:t xml:space="preserve">: </w:t>
-      </w:r>
+      <m:oMathPara>
+        <m:oMath>
+          <m:sSub>
+            <m:sSubPr>
+              <m:ctrlPr>
+                <w:rPr>
+                  <w:rFonts w:ascii="Cambria Math" w:hAnsi="Cambria Math"/>
+                  <w:i/>
+                </w:rPr>
+              </m:ctrlPr>
+            </m:sSubPr>
+            <m:e>
+              <m:r>
+                <w:rPr>
+                  <w:rFonts w:ascii="Cambria Math" w:hAnsi="Cambria Math"/>
+                </w:rPr>
+                <m:t>F</m:t>
+              </m:r>
+            </m:e>
+            <m:sub>
+              <m:r>
+                <w:rPr>
+                  <w:rFonts w:ascii="Cambria Math" w:hAnsi="Cambria Math"/>
+                </w:rPr>
+                <m:t>A</m:t>
+              </m:r>
+            </m:sub>
+          </m:sSub>
+          <m:r>
+            <w:rPr>
+              <w:rFonts w:ascii="Cambria Math" w:hAnsi="Cambria Math"/>
+            </w:rPr>
+            <m:t>=</m:t>
+          </m:r>
+          <m:d>
+            <m:dPr>
+              <m:ctrlPr>
+                <w:rPr>
+                  <w:rFonts w:ascii="Cambria Math" w:hAnsi="Cambria Math"/>
+                  <w:i/>
+                </w:rPr>
+              </m:ctrlPr>
+            </m:dPr>
+            <m:e>
+              <m:f>
+                <m:fPr>
+                  <m:ctrlPr>
+                    <w:rPr>
+                      <w:rFonts w:ascii="Cambria Math" w:hAnsi="Cambria Math"/>
+                      <w:i/>
+                    </w:rPr>
+                  </m:ctrlPr>
+                </m:fPr>
+                <m:num>
+                  <m:r>
+                    <w:rPr>
+                      <w:rFonts w:ascii="Cambria Math" w:hAnsi="Cambria Math"/>
+                    </w:rPr>
+                    <m:t>150</m:t>
+                  </m:r>
+                </m:num>
+                <m:den>
+                  <m:r>
+                    <w:rPr>
+                      <w:rFonts w:ascii="Cambria Math" w:hAnsi="Cambria Math"/>
+                    </w:rPr>
+                    <m:t>1000</m:t>
+                  </m:r>
+                </m:den>
+              </m:f>
+            </m:e>
+          </m:d>
+          <m:r>
+            <w:rPr>
+              <w:rFonts w:ascii="Cambria Math" w:hAnsi="Cambria Math"/>
+            </w:rPr>
+            <m:t xml:space="preserve">*9.8=1.47 </m:t>
+          </m:r>
+          <m:r>
+            <m:rPr>
+              <m:sty m:val="p"/>
+            </m:rPr>
+            <w:rPr>
+              <w:rFonts w:ascii="Cambria Math" w:hAnsi="Cambria Math"/>
+            </w:rPr>
+            <m:t>N</m:t>
+          </m:r>
+        </m:oMath>
+      </m:oMathPara>
     </w:p>
     <w:p>
       <w:pPr>
@@ -3298,7 +3456,7 @@
             <w:rPr>
               <w:rFonts w:ascii="Cambria Math" w:eastAsiaTheme="minorEastAsia" w:hAnsi="Cambria Math"/>
             </w:rPr>
-            <m:t>=150 ×</m:t>
+            <m:t>=1.47 ×</m:t>
           </m:r>
           <m:func>
             <m:funcPr>
@@ -3334,7 +3492,7 @@
             <w:rPr>
               <w:rFonts w:ascii="Cambria Math" w:eastAsiaTheme="minorEastAsia" w:hAnsi="Cambria Math"/>
             </w:rPr>
-            <m:t xml:space="preserve">=150 </m:t>
+            <m:t>=1.47 N</m:t>
           </m:r>
         </m:oMath>
       </m:oMathPara>
@@ -3384,7 +3542,7 @@
             <w:rPr>
               <w:rFonts w:ascii="Cambria Math" w:hAnsi="Cambria Math"/>
             </w:rPr>
-            <m:t xml:space="preserve">150× </m:t>
+            <m:t xml:space="preserve">1.47× </m:t>
           </m:r>
           <m:func>
             <m:funcPr>
@@ -3420,7 +3578,7 @@
             <w:rPr>
               <w:rFonts w:ascii="Cambria Math" w:hAnsi="Cambria Math"/>
             </w:rPr>
-            <m:t xml:space="preserve">=0 </m:t>
+            <m:t>=0 N</m:t>
           </m:r>
         </m:oMath>
       </m:oMathPara>
@@ -3437,7 +3595,7 @@
             <w:rPr>
               <w:rFonts w:ascii="Cambria Math" w:hAnsi="Cambria Math"/>
             </w:rPr>
-            <m:t>→A(150, 0)</m:t>
+            <m:t>→A(1.47, 0)</m:t>
           </m:r>
         </m:oMath>
       </m:oMathPara>
@@ -3461,6 +3619,117 @@
         </w:rPr>
         <w:t>:</w:t>
       </w:r>
+      <w:r>
+        <w:rPr>
+          <w:iCs/>
+        </w:rPr>
+        <w:t xml:space="preserve"> (With 200g)</w:t>
+      </w:r>
+    </w:p>
+    <w:p>
+      <w:pPr>
+        <w:pStyle w:val="NormalWeb"/>
+        <w:spacing w:before="0" w:beforeAutospacing="0" w:after="0" w:afterAutospacing="0"/>
+        <w:rPr>
+          <w:iCs/>
+        </w:rPr>
+      </w:pPr>
+      <m:oMathPara>
+        <m:oMath>
+          <m:sSub>
+            <m:sSubPr>
+              <m:ctrlPr>
+                <w:rPr>
+                  <w:rFonts w:ascii="Cambria Math" w:hAnsi="Cambria Math"/>
+                  <w:i/>
+                </w:rPr>
+              </m:ctrlPr>
+            </m:sSubPr>
+            <m:e>
+              <m:r>
+                <w:rPr>
+                  <w:rFonts w:ascii="Cambria Math" w:hAnsi="Cambria Math"/>
+                </w:rPr>
+                <m:t>F</m:t>
+              </m:r>
+            </m:e>
+            <m:sub>
+              <m:r>
+                <w:rPr>
+                  <w:rFonts w:ascii="Cambria Math" w:hAnsi="Cambria Math"/>
+                </w:rPr>
+                <m:t>B</m:t>
+              </m:r>
+            </m:sub>
+          </m:sSub>
+          <m:r>
+            <w:rPr>
+              <w:rFonts w:ascii="Cambria Math" w:hAnsi="Cambria Math"/>
+            </w:rPr>
+            <m:t>=</m:t>
+          </m:r>
+          <m:d>
+            <m:dPr>
+              <m:ctrlPr>
+                <w:rPr>
+                  <w:rFonts w:ascii="Cambria Math" w:hAnsi="Cambria Math"/>
+                  <w:i/>
+                </w:rPr>
+              </m:ctrlPr>
+            </m:dPr>
+            <m:e>
+              <m:f>
+                <m:fPr>
+                  <m:ctrlPr>
+                    <w:rPr>
+                      <w:rFonts w:ascii="Cambria Math" w:hAnsi="Cambria Math"/>
+                      <w:i/>
+                    </w:rPr>
+                  </m:ctrlPr>
+                </m:fPr>
+                <m:num>
+                  <m:r>
+                    <w:rPr>
+                      <w:rFonts w:ascii="Cambria Math" w:hAnsi="Cambria Math"/>
+                    </w:rPr>
+                    <m:t>200</m:t>
+                  </m:r>
+                </m:num>
+                <m:den>
+                  <m:r>
+                    <w:rPr>
+                      <w:rFonts w:ascii="Cambria Math" w:hAnsi="Cambria Math"/>
+                    </w:rPr>
+                    <m:t>1000</m:t>
+                  </m:r>
+                </m:den>
+              </m:f>
+            </m:e>
+          </m:d>
+          <m:r>
+            <w:rPr>
+              <w:rFonts w:ascii="Cambria Math" w:hAnsi="Cambria Math"/>
+            </w:rPr>
+            <m:t xml:space="preserve">*9.8=1.96 </m:t>
+          </m:r>
+          <m:r>
+            <m:rPr>
+              <m:sty m:val="p"/>
+            </m:rPr>
+            <w:rPr>
+              <w:rFonts w:ascii="Cambria Math" w:hAnsi="Cambria Math"/>
+            </w:rPr>
+            <m:t>N</m:t>
+          </m:r>
+        </m:oMath>
+      </m:oMathPara>
+    </w:p>
+    <w:p>
+      <w:pPr>
+        <w:rPr>
+          <w:iCs/>
+        </w:rPr>
+      </w:pPr>
     </w:p>
     <w:p>
       <w:pPr>
@@ -3501,7 +3770,7 @@
             <w:rPr>
               <w:rFonts w:ascii="Cambria Math" w:eastAsiaTheme="minorEastAsia" w:hAnsi="Cambria Math"/>
             </w:rPr>
-            <m:t>=200 ×</m:t>
+            <m:t>=1.96 ×</m:t>
           </m:r>
           <m:func>
             <m:funcPr>
@@ -3537,7 +3806,7 @@
             <w:rPr>
               <w:rFonts w:ascii="Cambria Math" w:eastAsiaTheme="minorEastAsia" w:hAnsi="Cambria Math"/>
             </w:rPr>
-            <m:t xml:space="preserve">=0 </m:t>
+            <m:t>=0 N</m:t>
           </m:r>
         </m:oMath>
       </m:oMathPara>
@@ -3581,7 +3850,7 @@
             <w:rPr>
               <w:rFonts w:ascii="Cambria Math" w:eastAsiaTheme="minorEastAsia" w:hAnsi="Cambria Math"/>
             </w:rPr>
-            <m:t>=200 ×</m:t>
+            <m:t>=1.96 ×</m:t>
           </m:r>
           <m:func>
             <m:funcPr>
@@ -3617,7 +3886,7 @@
             <w:rPr>
               <w:rFonts w:ascii="Cambria Math" w:eastAsiaTheme="minorEastAsia" w:hAnsi="Cambria Math"/>
             </w:rPr>
-            <m:t xml:space="preserve">=200 </m:t>
+            <m:t xml:space="preserve">=1.96 N </m:t>
           </m:r>
         </m:oMath>
       </m:oMathPara>
@@ -3634,8 +3903,7 @@
             <w:rPr>
               <w:rFonts w:ascii="Cambria Math" w:hAnsi="Cambria Math"/>
             </w:rPr>
-            <w:lastRenderedPageBreak/>
-            <m:t>→B(0, 200)</m:t>
+            <m:t>→B(0, 1.96)</m:t>
           </m:r>
         </m:oMath>
       </m:oMathPara>
@@ -3658,8 +3926,45 @@
           <w:iCs/>
           <w:u w:val="single"/>
         </w:rPr>
-        <w:t>Force C</w:t>
-      </w:r>
+        <w:t xml:space="preserve">Force </w:t>
+      </w:r>
+      <m:oMath>
+        <m:sSub>
+          <m:sSubPr>
+            <m:ctrlPr>
+              <w:rPr>
+                <w:rFonts w:ascii="Cambria Math" w:hAnsi="Cambria Math"/>
+                <w:i/>
+                <w:u w:val="single"/>
+              </w:rPr>
+            </m:ctrlPr>
+          </m:sSubPr>
+          <m:e>
+            <m:r>
+              <m:rPr>
+                <m:sty m:val="p"/>
+              </m:rPr>
+              <w:rPr>
+                <w:rFonts w:ascii="Cambria Math" w:hAnsi="Cambria Math"/>
+                <w:u w:val="single"/>
+              </w:rPr>
+              <m:t>C</m:t>
+            </m:r>
+          </m:e>
+          <m:sub>
+            <m:r>
+              <m:rPr>
+                <m:sty m:val="p"/>
+              </m:rPr>
+              <w:rPr>
+                <w:rFonts w:ascii="Cambria Math" w:hAnsi="Cambria Math"/>
+                <w:u w:val="single"/>
+              </w:rPr>
+              <m:t>cal</m:t>
+            </m:r>
+          </m:sub>
+        </m:sSub>
+      </m:oMath>
       <w:r>
         <w:rPr>
           <w:iCs/>
@@ -3767,7 +4072,7 @@
             <w:rPr>
               <w:rFonts w:ascii="Cambria Math" w:eastAsiaTheme="minorEastAsia" w:hAnsi="Cambria Math"/>
             </w:rPr>
-            <m:t xml:space="preserve">=-150-0=-150 </m:t>
+            <m:t xml:space="preserve">=-1.47-0=-1.47 N </m:t>
           </m:r>
         </m:oMath>
       </m:oMathPara>
@@ -3880,7 +4185,7 @@
             <w:rPr>
               <w:rFonts w:ascii="Cambria Math" w:eastAsiaTheme="minorEastAsia" w:hAnsi="Cambria Math"/>
             </w:rPr>
-            <m:t xml:space="preserve">=-0-200=-200 </m:t>
+            <m:t>=-0-1.96=-1.96 N</m:t>
           </m:r>
         </m:oMath>
       </m:oMathPara>
@@ -3897,7 +4202,7 @@
             <w:rPr>
               <w:rFonts w:ascii="Cambria Math" w:hAnsi="Cambria Math"/>
             </w:rPr>
-            <m:t>→C(-150,- 200)</m:t>
+            <m:t>→C(-1.47,- 1.96)</m:t>
           </m:r>
         </m:oMath>
       </m:oMathPara>
@@ -3981,7 +4286,7 @@
                   <w:rPr>
                     <w:rFonts w:ascii="Cambria Math" w:hAnsi="Cambria Math"/>
                   </w:rPr>
-                  <m:t>150)</m:t>
+                  <m:t>1.47)</m:t>
                 </m:r>
               </m:e>
               <m:sup>
@@ -4013,7 +4318,7 @@
                   <w:rPr>
                     <w:rFonts w:ascii="Cambria Math" w:hAnsi="Cambria Math"/>
                   </w:rPr>
-                  <m:t>(-200)</m:t>
+                  <m:t>(-1.96)</m:t>
                 </m:r>
               </m:e>
               <m:sup>
@@ -4031,7 +4336,7 @@
           <w:rPr>
             <w:rFonts w:ascii="Cambria Math" w:hAnsi="Cambria Math"/>
           </w:rPr>
-          <m:t xml:space="preserve">=250 </m:t>
+          <m:t>=2.45 N</m:t>
         </m:r>
       </m:oMath>
     </w:p>
@@ -4226,7 +4531,7 @@
                       <w:rPr>
                         <w:rFonts w:ascii="Cambria Math" w:hAnsi="Cambria Math"/>
                       </w:rPr>
-                      <m:t>-200</m:t>
+                      <m:t>-1.96</m:t>
                     </m:r>
                   </m:num>
                   <m:den>
@@ -4234,7 +4539,7 @@
                       <w:rPr>
                         <w:rFonts w:ascii="Cambria Math" w:hAnsi="Cambria Math"/>
                       </w:rPr>
-                      <m:t>-150</m:t>
+                      <m:t>-1.47</m:t>
                     </m:r>
                   </m:den>
                 </m:f>
@@ -4281,7 +4586,7 @@
             <w:rPr>
               <w:rFonts w:ascii="Cambria Math" w:hAnsi="Cambria Math"/>
             </w:rPr>
-            <m:t>Qu0061d.</m:t>
+            <m:t>Quad.</m:t>
           </m:r>
           <m:r>
             <w:rPr>
@@ -4309,7 +4614,264 @@
     </w:p>
     <w:p>
       <w:r>
-        <w:t xml:space="preserve">Difference = </w:t>
+        <w:t xml:space="preserve"> </w:t>
+      </w:r>
+      <w:r>
+        <w:rPr>
+          <w:u w:val="single"/>
+        </w:rPr>
+        <w:t xml:space="preserve">Force </w:t>
+      </w:r>
+      <m:oMath>
+        <m:sSub>
+          <m:sSubPr>
+            <m:ctrlPr>
+              <w:rPr>
+                <w:rFonts w:ascii="Cambria Math" w:eastAsiaTheme="minorEastAsia" w:hAnsi="Cambria Math"/>
+                <w:i/>
+                <w:u w:val="single"/>
+              </w:rPr>
+            </m:ctrlPr>
+          </m:sSubPr>
+          <m:e>
+            <m:r>
+              <w:rPr>
+                <w:rFonts w:ascii="Cambria Math" w:eastAsiaTheme="minorEastAsia" w:hAnsi="Cambria Math"/>
+                <w:u w:val="single"/>
+              </w:rPr>
+              <m:t>C</m:t>
+            </m:r>
+          </m:e>
+          <m:sub>
+            <m:r>
+              <w:rPr>
+                <w:rFonts w:ascii="Cambria Math" w:eastAsiaTheme="minorEastAsia" w:hAnsi="Cambria Math"/>
+                <w:u w:val="single"/>
+              </w:rPr>
+              <m:t>EXP</m:t>
+            </m:r>
+          </m:sub>
+        </m:sSub>
+      </m:oMath>
+      <w:r>
+        <w:t>: (With</w:t>
+      </w:r>
+      <w:r>
+        <w:t xml:space="preserve"> 243.8g</w:t>
+      </w:r>
+      <w:r>
+        <w:t>)</w:t>
+      </w:r>
+    </w:p>
+    <w:p>
+      <w:pPr>
+        <w:pStyle w:val="NormalWeb"/>
+        <w:spacing w:before="0" w:beforeAutospacing="0" w:after="0" w:afterAutospacing="0"/>
+        <w:rPr>
+          <w:iCs/>
+        </w:rPr>
+      </w:pPr>
+      <m:oMathPara>
+        <m:oMath>
+          <m:sSub>
+            <m:sSubPr>
+              <m:ctrlPr>
+                <w:rPr>
+                  <w:rFonts w:ascii="Cambria Math" w:hAnsi="Cambria Math"/>
+                  <w:i/>
+                </w:rPr>
+              </m:ctrlPr>
+            </m:sSubPr>
+            <m:e>
+              <m:r>
+                <w:rPr>
+                  <w:rFonts w:ascii="Cambria Math" w:hAnsi="Cambria Math"/>
+                </w:rPr>
+                <m:t>F</m:t>
+              </m:r>
+            </m:e>
+            <m:sub>
+              <m:r>
+                <w:rPr>
+                  <w:rFonts w:ascii="Cambria Math" w:hAnsi="Cambria Math"/>
+                </w:rPr>
+                <m:t>C</m:t>
+              </m:r>
+            </m:sub>
+          </m:sSub>
+          <m:r>
+            <w:rPr>
+              <w:rFonts w:ascii="Cambria Math" w:hAnsi="Cambria Math"/>
+            </w:rPr>
+            <m:t>=</m:t>
+          </m:r>
+          <m:d>
+            <m:dPr>
+              <m:ctrlPr>
+                <w:rPr>
+                  <w:rFonts w:ascii="Cambria Math" w:hAnsi="Cambria Math"/>
+                  <w:i/>
+                </w:rPr>
+              </m:ctrlPr>
+            </m:dPr>
+            <m:e>
+              <m:f>
+                <m:fPr>
+                  <m:ctrlPr>
+                    <w:rPr>
+                      <w:rFonts w:ascii="Cambria Math" w:hAnsi="Cambria Math"/>
+                      <w:i/>
+                    </w:rPr>
+                  </m:ctrlPr>
+                </m:fPr>
+                <m:num>
+                  <m:r>
+                    <w:rPr>
+                      <w:rFonts w:ascii="Cambria Math" w:hAnsi="Cambria Math"/>
+                    </w:rPr>
+                    <m:t>243.8</m:t>
+                  </m:r>
+                </m:num>
+                <m:den>
+                  <m:r>
+                    <w:rPr>
+                      <w:rFonts w:ascii="Cambria Math" w:hAnsi="Cambria Math"/>
+                    </w:rPr>
+                    <m:t>1000</m:t>
+                  </m:r>
+                </m:den>
+              </m:f>
+            </m:e>
+          </m:d>
+          <m:r>
+            <w:rPr>
+              <w:rFonts w:ascii="Cambria Math" w:hAnsi="Cambria Math"/>
+            </w:rPr>
+            <m:t xml:space="preserve">*9.8=2.39 </m:t>
+          </m:r>
+          <m:r>
+            <m:rPr>
+              <m:sty m:val="p"/>
+            </m:rPr>
+            <w:rPr>
+              <w:rFonts w:ascii="Cambria Math" w:hAnsi="Cambria Math"/>
+            </w:rPr>
+            <m:t>N</m:t>
+          </m:r>
+        </m:oMath>
+      </m:oMathPara>
+    </w:p>
+    <w:p>
+      <w:pPr>
+        <w:pStyle w:val="NormalWeb"/>
+        <w:spacing w:before="0" w:beforeAutospacing="0" w:after="0" w:afterAutospacing="0"/>
+        <w:rPr>
+          <w:iCs/>
+        </w:rPr>
+      </w:pPr>
+      <w:r>
+        <w:rPr>
+          <w:iCs/>
+        </w:rPr>
+        <w:t>With 30g 4</w:t>
+      </w:r>
+      <m:oMath>
+        <m:r>
+          <w:rPr>
+            <w:rFonts w:ascii="Cambria Math" w:hAnsi="Cambria Math"/>
+          </w:rPr>
+          <m:t>°</m:t>
+        </m:r>
+      </m:oMath>
+      <w:r>
+        <w:rPr>
+          <w:iCs/>
+        </w:rPr>
+        <w:t>until the ring quit being in the central:</w:t>
+      </w:r>
+    </w:p>
+    <w:p>
+      <w:pPr>
+        <w:pStyle w:val="NormalWeb"/>
+        <w:spacing w:before="0" w:beforeAutospacing="0" w:after="0" w:afterAutospacing="0"/>
+        <w:rPr>
+          <w:iCs/>
+        </w:rPr>
+      </w:pPr>
+      <m:oMathPara>
+        <m:oMath>
+          <m:r>
+            <w:rPr>
+              <w:rFonts w:ascii="Cambria Math" w:hAnsi="Cambria Math"/>
+            </w:rPr>
+            <m:t>F=</m:t>
+          </m:r>
+          <m:d>
+            <m:dPr>
+              <m:ctrlPr>
+                <w:rPr>
+                  <w:rFonts w:ascii="Cambria Math" w:hAnsi="Cambria Math"/>
+                  <w:i/>
+                  <w:iCs/>
+                </w:rPr>
+              </m:ctrlPr>
+            </m:dPr>
+            <m:e>
+              <m:f>
+                <m:fPr>
+                  <m:ctrlPr>
+                    <w:rPr>
+                      <w:rFonts w:ascii="Cambria Math" w:hAnsi="Cambria Math"/>
+                      <w:i/>
+                      <w:iCs/>
+                    </w:rPr>
+                  </m:ctrlPr>
+                </m:fPr>
+                <m:num>
+                  <m:r>
+                    <w:rPr>
+                      <w:rFonts w:ascii="Cambria Math" w:hAnsi="Cambria Math"/>
+                    </w:rPr>
+                    <m:t>30</m:t>
+                  </m:r>
+                </m:num>
+                <m:den>
+                  <m:r>
+                    <w:rPr>
+                      <w:rFonts w:ascii="Cambria Math" w:hAnsi="Cambria Math"/>
+                    </w:rPr>
+                    <m:t>1000</m:t>
+                  </m:r>
+                </m:den>
+              </m:f>
+            </m:e>
+          </m:d>
+          <m:r>
+            <w:rPr>
+              <w:rFonts w:ascii="Cambria Math" w:hAnsi="Cambria Math"/>
+            </w:rPr>
+            <m:t>*9.8=0.294 N</m:t>
+          </m:r>
+        </m:oMath>
+      </m:oMathPara>
+    </w:p>
+    <w:p>
+      <w:pPr>
+        <w:rPr>
+          <w:b/>
+          <w:bCs/>
+        </w:rPr>
+      </w:pPr>
+    </w:p>
+    <w:p>
+      <w:r>
+        <w:rPr>
+          <w:u w:val="single"/>
+        </w:rPr>
+        <w:t>Difference</w:t>
+      </w:r>
+      <w:r>
+        <w:t xml:space="preserve"> = </w:t>
       </w:r>
       <m:oMath>
         <m:sSub>
@@ -4374,13 +4936,19 @@
           <w:rPr>
             <w:rFonts w:ascii="Cambria Math" w:eastAsiaTheme="minorEastAsia" w:hAnsi="Cambria Math"/>
           </w:rPr>
-          <m:t>=250-248=2</m:t>
+          <m:t>=2.45-2.39=0.06 N</m:t>
         </m:r>
       </m:oMath>
     </w:p>
     <w:p>
       <w:r>
-        <w:t xml:space="preserve">% Difference </w:t>
+        <w:rPr>
+          <w:u w:val="single"/>
+        </w:rPr>
+        <w:t>% Difference</w:t>
+      </w:r>
+      <w:r>
+        <w:t xml:space="preserve"> </w:t>
       </w:r>
       <m:oMath>
         <m:r>
@@ -4591,7 +5159,7 @@
               <w:rPr>
                 <w:rFonts w:ascii="Cambria Math" w:hAnsi="Cambria Math"/>
               </w:rPr>
-              <m:t>2</m:t>
+              <m:t>|0.06|</m:t>
             </m:r>
           </m:num>
           <m:den>
@@ -4625,7 +5193,7 @@
               <w:rPr>
                 <w:rFonts w:ascii="Cambria Math" w:hAnsi="Cambria Math"/>
               </w:rPr>
-              <m:t>(250+248)</m:t>
+              <m:t>(2.45+2.39)</m:t>
             </m:r>
           </m:den>
         </m:f>
@@ -4639,7 +5207,7 @@
           <w:rPr>
             <w:rFonts w:ascii="Cambria Math" w:hAnsi="Cambria Math"/>
           </w:rPr>
-          <m:t>=0.8%</m:t>
+          <m:t>=2.48%</m:t>
         </m:r>
       </m:oMath>
     </w:p>
@@ -4716,13 +5284,13 @@
     </w:p>
     <w:tbl>
       <w:tblPr>
-        <w:tblW w:w="8005" w:type="dxa"/>
+        <w:tblW w:w="8185" w:type="dxa"/>
         <w:tblLook w:val="04A0" w:firstRow="1" w:lastRow="0" w:firstColumn="1" w:lastColumn="0" w:noHBand="0" w:noVBand="1"/>
       </w:tblPr>
       <w:tblGrid>
         <w:gridCol w:w="2280"/>
-        <w:gridCol w:w="3025"/>
-        <w:gridCol w:w="2700"/>
+        <w:gridCol w:w="3475"/>
+        <w:gridCol w:w="2430"/>
       </w:tblGrid>
       <w:tr>
         <w:trPr>
@@ -4760,7 +5328,7 @@
         </w:tc>
         <w:tc>
           <w:tcPr>
-            <w:tcW w:w="3025" w:type="dxa"/>
+            <w:tcW w:w="3475" w:type="dxa"/>
             <w:tcBorders>
               <w:top w:val="single" w:sz="4" w:space="0" w:color="auto"/>
               <w:left w:val="nil"/>
@@ -4791,13 +5359,27 @@
                 <w:sz w:val="28"/>
                 <w:szCs w:val="28"/>
               </w:rPr>
-              <w:t xml:space="preserve"> (g)</w:t>
+              <w:t xml:space="preserve"> (</w:t>
+            </w:r>
+            <w:r>
+              <w:rPr>
+                <w:sz w:val="28"/>
+                <w:szCs w:val="28"/>
+              </w:rPr>
+              <w:t>N</w:t>
+            </w:r>
+            <w:r>
+              <w:rPr>
+                <w:sz w:val="28"/>
+                <w:szCs w:val="28"/>
+              </w:rPr>
+              <w:t>)</w:t>
             </w:r>
           </w:p>
         </w:tc>
         <w:tc>
           <w:tcPr>
-            <w:tcW w:w="2700" w:type="dxa"/>
+            <w:tcW w:w="2430" w:type="dxa"/>
             <w:tcBorders>
               <w:top w:val="single" w:sz="4" w:space="0" w:color="auto"/>
               <w:left w:val="nil"/>
@@ -4901,7 +5483,7 @@
         </w:tc>
         <w:tc>
           <w:tcPr>
-            <w:tcW w:w="3025" w:type="dxa"/>
+            <w:tcW w:w="3475" w:type="dxa"/>
             <w:tcBorders>
               <w:top w:val="nil"/>
               <w:left w:val="nil"/>
@@ -4933,12 +5515,23 @@
                   </m:rPr>
                   <w:rPr>
                     <w:rFonts w:ascii="Cambria Math" w:hAnsi="Cambria Math"/>
+                    <w:sz w:val="28"/>
+                    <w:szCs w:val="28"/>
+                  </w:rPr>
+                  <m:t>1.1956</m:t>
+                </m:r>
+                <m:r>
+                  <m:rPr>
+                    <m:sty m:val="p"/>
+                  </m:rPr>
+                  <w:rPr>
+                    <w:rFonts w:ascii="Cambria Math" w:hAnsi="Cambria Math"/>
                     <w:color w:val="404040" w:themeColor="text1" w:themeTint="BF"/>
                     <w:kern w:val="24"/>
                     <w:sz w:val="28"/>
                     <w:szCs w:val="28"/>
                   </w:rPr>
-                  <m:t xml:space="preserve">125.17±20N </m:t>
+                  <m:t xml:space="preserve">±0.196N </m:t>
                 </m:r>
                 <m:d>
                   <m:dPr>
@@ -4960,12 +5553,23 @@
                       </m:rPr>
                       <w:rPr>
                         <w:rFonts w:ascii="Cambria Math" w:hAnsi="Cambria Math"/>
+                        <w:sz w:val="28"/>
+                        <w:szCs w:val="28"/>
+                      </w:rPr>
+                      <m:t>3.03</m:t>
+                    </m:r>
+                    <m:r>
+                      <m:rPr>
+                        <m:sty m:val="p"/>
+                      </m:rPr>
+                      <w:rPr>
+                        <w:rFonts w:ascii="Cambria Math" w:hAnsi="Cambria Math"/>
                         <w:color w:val="404040" w:themeColor="text1" w:themeTint="BF"/>
                         <w:kern w:val="24"/>
                         <w:sz w:val="28"/>
                         <w:szCs w:val="28"/>
                       </w:rPr>
-                      <m:t>2.57%</m:t>
+                      <m:t>%</m:t>
                     </m:r>
                   </m:e>
                 </m:d>
@@ -4975,7 +5579,7 @@
         </w:tc>
         <w:tc>
           <w:tcPr>
-            <w:tcW w:w="2700" w:type="dxa"/>
+            <w:tcW w:w="2430" w:type="dxa"/>
             <w:tcBorders>
               <w:top w:val="nil"/>
               <w:left w:val="nil"/>
@@ -5031,18 +5635,18 @@
         </w:tc>
       </w:tr>
     </w:tbl>
-    <w:p/>
     <w:p>
       <w:r>
         <w:rPr>
           <w:noProof/>
           <w14:ligatures w14:val="standardContextual"/>
         </w:rPr>
+        <w:lastRenderedPageBreak/>
         <w:drawing>
-          <wp:inline distT="0" distB="0" distL="0" distR="0" wp14:anchorId="603150A6" wp14:editId="5EEFCE43">
-            <wp:extent cx="2861509" cy="3165857"/>
-            <wp:effectExtent l="0" t="0" r="15240" b="15875"/>
-            <wp:docPr id="15" name="Chart 15">
+          <wp:inline distT="0" distB="0" distL="0" distR="0" wp14:anchorId="40A7A839" wp14:editId="57DF9CF4">
+            <wp:extent cx="2852979" cy="3170731"/>
+            <wp:effectExtent l="0" t="0" r="5080" b="10795"/>
+            <wp:docPr id="5" name="Chart 5">
               <a:extLst xmlns:a="http://schemas.openxmlformats.org/drawingml/2006/main">
                 <a:ext uri="{FF2B5EF4-FFF2-40B4-BE49-F238E27FC236}">
                   <a16:creationId xmlns:a16="http://schemas.microsoft.com/office/drawing/2014/main" id="{00000000-0008-0000-0000-000004000000}"/>
@@ -5064,10 +5668,10 @@
           <w14:ligatures w14:val="standardContextual"/>
         </w:rPr>
         <w:drawing>
-          <wp:inline distT="0" distB="0" distL="0" distR="0" wp14:anchorId="2F4302D1" wp14:editId="38CFD595">
-            <wp:extent cx="2852329" cy="3156857"/>
-            <wp:effectExtent l="0" t="0" r="5715" b="5715"/>
-            <wp:docPr id="16" name="Chart 16">
+          <wp:inline distT="0" distB="0" distL="0" distR="0" wp14:anchorId="05DDFAE7" wp14:editId="4FA1DB73">
+            <wp:extent cx="2838248" cy="3161731"/>
+            <wp:effectExtent l="0" t="0" r="635" b="635"/>
+            <wp:docPr id="6" name="Chart 6">
               <a:extLst xmlns:a="http://schemas.openxmlformats.org/drawingml/2006/main">
                 <a:ext uri="{FF2B5EF4-FFF2-40B4-BE49-F238E27FC236}">
                   <a16:creationId xmlns:a16="http://schemas.microsoft.com/office/drawing/2014/main" id="{00000000-0008-0000-0000-000002000000}"/>
@@ -5090,12 +5694,11 @@
           <w:noProof/>
           <w14:ligatures w14:val="standardContextual"/>
         </w:rPr>
-        <w:lastRenderedPageBreak/>
         <w:drawing>
-          <wp:inline distT="0" distB="0" distL="0" distR="0" wp14:anchorId="1386F19E" wp14:editId="62724593">
-            <wp:extent cx="3018790" cy="3168037"/>
-            <wp:effectExtent l="0" t="0" r="10160" b="13335"/>
-            <wp:docPr id="17" name="Chart 17">
+          <wp:inline distT="0" distB="0" distL="0" distR="0" wp14:anchorId="1179C5FC" wp14:editId="07AD015C">
+            <wp:extent cx="3039818" cy="3161731"/>
+            <wp:effectExtent l="0" t="0" r="8255" b="635"/>
+            <wp:docPr id="7" name="Chart 7">
               <a:extLst xmlns:a="http://schemas.openxmlformats.org/drawingml/2006/main">
                 <a:ext uri="{FF2B5EF4-FFF2-40B4-BE49-F238E27FC236}">
                   <a16:creationId xmlns:a16="http://schemas.microsoft.com/office/drawing/2014/main" id="{00000000-0008-0000-0000-000003000000}"/>
@@ -5117,10 +5720,10 @@
           <w14:ligatures w14:val="standardContextual"/>
         </w:rPr>
         <w:drawing>
-          <wp:inline distT="0" distB="0" distL="0" distR="0" wp14:anchorId="3C796744" wp14:editId="187B7060">
-            <wp:extent cx="2897269" cy="3165280"/>
-            <wp:effectExtent l="0" t="0" r="17780" b="16510"/>
-            <wp:docPr id="18" name="Chart 18">
+          <wp:inline distT="0" distB="0" distL="0" distR="0" wp14:anchorId="1E31FA2F" wp14:editId="7E5794BE">
+            <wp:extent cx="2883188" cy="3174758"/>
+            <wp:effectExtent l="0" t="0" r="12700" b="6985"/>
+            <wp:docPr id="8" name="Chart 8">
               <a:extLst xmlns:a="http://schemas.openxmlformats.org/drawingml/2006/main">
                 <a:ext uri="{FF2B5EF4-FFF2-40B4-BE49-F238E27FC236}">
                   <a16:creationId xmlns:a16="http://schemas.microsoft.com/office/drawing/2014/main" id="{00000000-0008-0000-0000-000005000000}"/>
@@ -5137,9 +5740,6 @@
         </w:drawing>
       </w:r>
     </w:p>
-    <w:p/>
-    <w:p/>
-    <w:p/>
     <w:tbl>
       <w:tblPr>
         <w:tblW w:w="10720" w:type="dxa"/>
@@ -5232,6 +5832,17 @@
               </w:rPr>
               <w:t>Magnitude</w:t>
             </w:r>
+            <w:r>
+              <w:rPr>
+                <w:b/>
+                <w:bCs/>
+                <w:i/>
+                <w:iCs/>
+                <w:sz w:val="28"/>
+                <w:szCs w:val="28"/>
+              </w:rPr>
+              <w:t xml:space="preserve"> (N)</w:t>
+            </w:r>
           </w:p>
         </w:tc>
         <w:tc>
@@ -5310,6 +5921,17 @@
               </w:rPr>
               <w:t>x-component</w:t>
             </w:r>
+            <w:r>
+              <w:rPr>
+                <w:b/>
+                <w:bCs/>
+                <w:i/>
+                <w:iCs/>
+                <w:sz w:val="28"/>
+                <w:szCs w:val="28"/>
+              </w:rPr>
+              <w:t xml:space="preserve"> (N)</w:t>
+            </w:r>
           </w:p>
         </w:tc>
         <w:tc>
@@ -5348,6 +5970,17 @@
                 <w:szCs w:val="28"/>
               </w:rPr>
               <w:t>y-component</w:t>
+            </w:r>
+            <w:r>
+              <w:rPr>
+                <w:b/>
+                <w:bCs/>
+                <w:i/>
+                <w:iCs/>
+                <w:sz w:val="28"/>
+                <w:szCs w:val="28"/>
+              </w:rPr>
+              <w:t xml:space="preserve"> (N)</w:t>
             </w:r>
           </w:p>
         </w:tc>
@@ -5418,7 +6051,14 @@
                 <w:sz w:val="28"/>
                 <w:szCs w:val="28"/>
               </w:rPr>
-              <w:t>210.00</w:t>
+              <w:t>2</w:t>
+            </w:r>
+            <w:r>
+              <w:rPr>
+                <w:sz w:val="28"/>
+                <w:szCs w:val="28"/>
+              </w:rPr>
+              <w:t>.058</w:t>
             </w:r>
           </w:p>
         </w:tc>
@@ -5480,7 +6120,7 @@
                 <w:sz w:val="28"/>
                 <w:szCs w:val="28"/>
               </w:rPr>
-              <w:t>-134.99</w:t>
+              <w:t>-1.32</w:t>
             </w:r>
           </w:p>
         </w:tc>
@@ -5511,7 +6151,7 @@
                 <w:sz w:val="28"/>
                 <w:szCs w:val="28"/>
               </w:rPr>
-              <w:t>160.87</w:t>
+              <w:t>1.58</w:t>
             </w:r>
           </w:p>
         </w:tc>
@@ -5582,7 +6222,7 @@
                 <w:sz w:val="28"/>
                 <w:szCs w:val="28"/>
               </w:rPr>
-              <w:t>250.00</w:t>
+              <w:t>2.45</w:t>
             </w:r>
           </w:p>
         </w:tc>
@@ -5644,7 +6284,7 @@
                 <w:sz w:val="28"/>
                 <w:szCs w:val="28"/>
               </w:rPr>
-              <w:t>234.92</w:t>
+              <w:t>2.30</w:t>
             </w:r>
           </w:p>
         </w:tc>
@@ -5675,7 +6315,7 @@
                 <w:sz w:val="28"/>
                 <w:szCs w:val="28"/>
               </w:rPr>
-              <w:t>-85.51</w:t>
+              <w:t>-.84</w:t>
             </w:r>
           </w:p>
         </w:tc>
@@ -5746,7 +6386,14 @@
                 <w:sz w:val="28"/>
                 <w:szCs w:val="28"/>
               </w:rPr>
-              <w:t>125.17</w:t>
+              <w:t>1.226</w:t>
+            </w:r>
+            <w:r>
+              <w:rPr>
+                <w:sz w:val="28"/>
+                <w:szCs w:val="28"/>
+              </w:rPr>
+              <w:t>7</w:t>
             </w:r>
           </w:p>
         </w:tc>
@@ -5808,7 +6455,7 @@
                 <w:sz w:val="28"/>
                 <w:szCs w:val="28"/>
               </w:rPr>
-              <w:t>-99.94</w:t>
+              <w:t>-.98</w:t>
             </w:r>
           </w:p>
         </w:tc>
@@ -5839,7 +6486,7 @@
                 <w:sz w:val="28"/>
                 <w:szCs w:val="28"/>
               </w:rPr>
-              <w:t>-75.36</w:t>
+              <w:t>-.74</w:t>
             </w:r>
           </w:p>
         </w:tc>
@@ -5910,7 +6557,7 @@
                 <w:sz w:val="28"/>
                 <w:szCs w:val="28"/>
               </w:rPr>
-              <w:t>122.00</w:t>
+              <w:t>1.1956</w:t>
             </w:r>
           </w:p>
         </w:tc>
@@ -6067,7 +6714,7 @@
                 <w:sz w:val="28"/>
                 <w:szCs w:val="28"/>
               </w:rPr>
-              <w:t>3.17</w:t>
+              <w:t>0.04</w:t>
             </w:r>
           </w:p>
         </w:tc>
@@ -6224,14 +6871,7 @@
                 <w:sz w:val="28"/>
                 <w:szCs w:val="28"/>
               </w:rPr>
-              <w:t>2.5</w:t>
-            </w:r>
-            <w:r>
-              <w:rPr>
-                <w:sz w:val="28"/>
-                <w:szCs w:val="28"/>
-              </w:rPr>
-              <w:t>7</w:t>
+              <w:t>3.03</w:t>
             </w:r>
           </w:p>
         </w:tc>
@@ -6335,7 +6975,44 @@
         <w:t>Force A</w:t>
       </w:r>
       <w:r>
-        <w:t xml:space="preserve">: </w:t>
+        <w:t>: (210g)</w:t>
+      </w:r>
+    </w:p>
+    <w:p>
+      <w:pPr>
+        <w:pStyle w:val="NormalWeb"/>
+        <w:spacing w:before="0" w:beforeAutospacing="0" w:after="0" w:afterAutospacing="0"/>
+      </w:pPr>
+      <m:oMath>
+        <m:sSub>
+          <m:sSubPr>
+            <m:ctrlPr>
+              <w:rPr>
+                <w:rFonts w:ascii="Cambria Math" w:hAnsi="Cambria Math"/>
+                <w:i/>
+              </w:rPr>
+            </m:ctrlPr>
+          </m:sSubPr>
+          <m:e>
+            <m:r>
+              <w:rPr>
+                <w:rFonts w:ascii="Cambria Math" w:hAnsi="Cambria Math"/>
+              </w:rPr>
+              <m:t>F</m:t>
+            </m:r>
+          </m:e>
+          <m:sub>
+            <m:r>
+              <w:rPr>
+                <w:rFonts w:ascii="Cambria Math" w:hAnsi="Cambria Math"/>
+              </w:rPr>
+              <m:t>A</m:t>
+            </m:r>
+          </m:sub>
+        </m:sSub>
+      </m:oMath>
+      <w:r>
+        <w:t xml:space="preserve"> = (210g/1000) * (9.8 m/s^2) = 2.058N</w:t>
       </w:r>
     </w:p>
     <w:p>
@@ -6376,7 +7053,7 @@
             <w:rPr>
               <w:rFonts w:ascii="Cambria Math" w:eastAsiaTheme="minorEastAsia" w:hAnsi="Cambria Math"/>
             </w:rPr>
-            <m:t>=210 ×</m:t>
+            <m:t>=2.058×</m:t>
           </m:r>
           <m:func>
             <m:funcPr>
@@ -6412,7 +7089,7 @@
             <w:rPr>
               <w:rFonts w:ascii="Cambria Math" w:eastAsiaTheme="minorEastAsia" w:hAnsi="Cambria Math"/>
             </w:rPr>
-            <m:t xml:space="preserve">=-134.99 </m:t>
+            <m:t>=-1.32N</m:t>
           </m:r>
         </m:oMath>
       </m:oMathPara>
@@ -6462,7 +7139,7 @@
             <w:rPr>
               <w:rFonts w:ascii="Cambria Math" w:hAnsi="Cambria Math"/>
             </w:rPr>
-            <m:t xml:space="preserve">210× </m:t>
+            <m:t xml:space="preserve">2.058× </m:t>
           </m:r>
           <m:func>
             <m:funcPr>
@@ -6498,7 +7175,19 @@
             <w:rPr>
               <w:rFonts w:ascii="Cambria Math" w:hAnsi="Cambria Math"/>
             </w:rPr>
-            <m:t>=160.87</m:t>
+            <m:t>=1.58N</m:t>
+          </m:r>
+        </m:oMath>
+      </m:oMathPara>
+    </w:p>
+    <w:p>
+      <m:oMathPara>
+        <m:oMath>
+          <m:r>
+            <w:rPr>
+              <w:rFonts w:ascii="Cambria Math" w:hAnsi="Cambria Math"/>
+            </w:rPr>
+            <m:t>→A(-1.32, 1.58)</m:t>
           </m:r>
         </m:oMath>
       </m:oMathPara>
@@ -6509,16 +7198,18 @@
           <w:iCs/>
         </w:rPr>
       </w:pPr>
-      <m:oMathPara>
-        <m:oMath>
-          <m:r>
-            <w:rPr>
-              <w:rFonts w:ascii="Cambria Math" w:hAnsi="Cambria Math"/>
-            </w:rPr>
-            <m:t>→A(-134.99, 160.87)</m:t>
-          </m:r>
-        </m:oMath>
-      </m:oMathPara>
+      <w:r>
+        <w:tab/>
+      </w:r>
+      <w:r>
+        <w:tab/>
+      </w:r>
+      <w:r>
+        <w:tab/>
+      </w:r>
+      <w:r>
+        <w:tab/>
+      </w:r>
     </w:p>
     <w:p>
       <w:pPr>
@@ -6537,7 +7228,45 @@
         <w:rPr>
           <w:iCs/>
         </w:rPr>
-        <w:t>:</w:t>
+        <w:t>: (250g)</w:t>
+      </w:r>
+    </w:p>
+    <w:p>
+      <w:pPr>
+        <w:rPr>
+          <w:iCs/>
+        </w:rPr>
+      </w:pPr>
+      <m:oMath>
+        <m:sSub>
+          <m:sSubPr>
+            <m:ctrlPr>
+              <w:rPr>
+                <w:rFonts w:ascii="Cambria Math" w:hAnsi="Cambria Math"/>
+                <w:i/>
+              </w:rPr>
+            </m:ctrlPr>
+          </m:sSubPr>
+          <m:e>
+            <m:r>
+              <w:rPr>
+                <w:rFonts w:ascii="Cambria Math" w:hAnsi="Cambria Math"/>
+              </w:rPr>
+              <m:t>F</m:t>
+            </m:r>
+          </m:e>
+          <m:sub>
+            <m:r>
+              <w:rPr>
+                <w:rFonts w:ascii="Cambria Math" w:hAnsi="Cambria Math"/>
+              </w:rPr>
+              <m:t>B</m:t>
+            </m:r>
+          </m:sub>
+        </m:sSub>
+      </m:oMath>
+      <w:r>
+        <w:t xml:space="preserve"> = (250g/1000) * (9.8m/s^2) = 2.45N</w:t>
       </w:r>
     </w:p>
     <w:p>
@@ -6579,7 +7308,7 @@
             <w:rPr>
               <w:rFonts w:ascii="Cambria Math" w:eastAsiaTheme="minorEastAsia" w:hAnsi="Cambria Math"/>
             </w:rPr>
-            <m:t>=250 ×</m:t>
+            <m:t>=2.45×</m:t>
           </m:r>
           <m:func>
             <m:funcPr>
@@ -6615,7 +7344,7 @@
             <w:rPr>
               <w:rFonts w:ascii="Cambria Math" w:eastAsiaTheme="minorEastAsia" w:hAnsi="Cambria Math"/>
             </w:rPr>
-            <m:t xml:space="preserve">=234.92 </m:t>
+            <m:t>=2.30N</m:t>
           </m:r>
         </m:oMath>
       </m:oMathPara>
@@ -6659,7 +7388,7 @@
             <w:rPr>
               <w:rFonts w:ascii="Cambria Math" w:eastAsiaTheme="minorEastAsia" w:hAnsi="Cambria Math"/>
             </w:rPr>
-            <m:t>=250 ×</m:t>
+            <m:t>=2.45 ×</m:t>
           </m:r>
           <m:func>
             <m:funcPr>
@@ -6695,7 +7424,19 @@
             <w:rPr>
               <w:rFonts w:ascii="Cambria Math" w:eastAsiaTheme="minorEastAsia" w:hAnsi="Cambria Math"/>
             </w:rPr>
-            <m:t xml:space="preserve">=-85.51 </m:t>
+            <m:t>=-0.84N</m:t>
+          </m:r>
+        </m:oMath>
+      </m:oMathPara>
+    </w:p>
+    <w:p>
+      <m:oMathPara>
+        <m:oMath>
+          <m:r>
+            <w:rPr>
+              <w:rFonts w:ascii="Cambria Math" w:hAnsi="Cambria Math"/>
+            </w:rPr>
+            <m:t>→B(2.30, -0.84)</m:t>
           </m:r>
         </m:oMath>
       </m:oMathPara>
@@ -6706,16 +7447,18 @@
           <w:iCs/>
         </w:rPr>
       </w:pPr>
-      <m:oMathPara>
-        <m:oMath>
-          <m:r>
-            <w:rPr>
-              <w:rFonts w:ascii="Cambria Math" w:hAnsi="Cambria Math"/>
-            </w:rPr>
-            <m:t>→B(234.92, -85.51)</m:t>
-          </m:r>
-        </m:oMath>
-      </m:oMathPara>
+      <w:r>
+        <w:tab/>
+      </w:r>
+      <w:r>
+        <w:tab/>
+      </w:r>
+      <w:r>
+        <w:tab/>
+      </w:r>
+      <w:r>
+        <w:tab/>
+      </w:r>
     </w:p>
     <w:p>
       <w:pPr>
@@ -6861,7 +7604,7 @@
                 <w:rPr>
                   <w:rFonts w:ascii="Cambria Math" w:eastAsiaTheme="minorEastAsia" w:hAnsi="Cambria Math"/>
                 </w:rPr>
-                <m:t>-134.99</m:t>
+                <m:t>-1.32</m:t>
               </m:r>
             </m:e>
           </m:d>
@@ -6869,7 +7612,7 @@
             <w:rPr>
               <w:rFonts w:ascii="Cambria Math" w:eastAsiaTheme="minorEastAsia" w:hAnsi="Cambria Math"/>
             </w:rPr>
-            <m:t>-234.92= -99.94</m:t>
+            <m:t>-2.30= -.98</m:t>
           </m:r>
         </m:oMath>
       </m:oMathPara>
@@ -6982,7 +7725,7 @@
             <w:rPr>
               <w:rFonts w:ascii="Cambria Math" w:eastAsiaTheme="minorEastAsia" w:hAnsi="Cambria Math"/>
             </w:rPr>
-            <m:t>=-160.87-</m:t>
+            <m:t>=-1.58-</m:t>
           </m:r>
           <m:d>
             <m:dPr>
@@ -6999,7 +7742,7 @@
                 <w:rPr>
                   <w:rFonts w:ascii="Cambria Math" w:eastAsiaTheme="minorEastAsia" w:hAnsi="Cambria Math"/>
                 </w:rPr>
-                <m:t>-85.51</m:t>
+                <m:t>-.84</m:t>
               </m:r>
             </m:e>
           </m:d>
@@ -7007,17 +7750,12 @@
             <w:rPr>
               <w:rFonts w:ascii="Cambria Math" w:eastAsiaTheme="minorEastAsia" w:hAnsi="Cambria Math"/>
             </w:rPr>
-            <m:t>= -75.36</m:t>
+            <m:t>= -.74</m:t>
           </m:r>
         </m:oMath>
       </m:oMathPara>
     </w:p>
     <w:p>
-      <w:pPr>
-        <w:rPr>
-          <w:iCs/>
-        </w:rPr>
-      </w:pPr>
       <m:oMathPara>
         <m:oMath>
           <m:r>
@@ -7041,7 +7779,7 @@
                 <w:rPr>
                   <w:rFonts w:ascii="Cambria Math" w:hAnsi="Cambria Math"/>
                 </w:rPr>
-                <m:t>-99.94, -75.36</m:t>
+                <m:t>-.98, -.74</m:t>
               </m:r>
             </m:e>
           </m:d>
@@ -7127,7 +7865,7 @@
                   <w:rPr>
                     <w:rFonts w:ascii="Cambria Math" w:hAnsi="Cambria Math"/>
                   </w:rPr>
-                  <m:t>(-99.94)</m:t>
+                  <m:t>(-0.98)</m:t>
                 </m:r>
               </m:e>
               <m:sup>
@@ -7159,7 +7897,7 @@
                   <w:rPr>
                     <w:rFonts w:ascii="Cambria Math" w:hAnsi="Cambria Math"/>
                   </w:rPr>
-                  <m:t>(-75.36)</m:t>
+                  <m:t>(-0.74)</m:t>
                 </m:r>
               </m:e>
               <m:sup>
@@ -7177,7 +7915,7 @@
           <w:rPr>
             <w:rFonts w:ascii="Cambria Math" w:hAnsi="Cambria Math"/>
           </w:rPr>
-          <m:t xml:space="preserve">=125.17 </m:t>
+          <m:t>=1.2267 N</m:t>
         </m:r>
       </m:oMath>
     </w:p>
@@ -7372,7 +8110,7 @@
                       <w:rPr>
                         <w:rFonts w:ascii="Cambria Math" w:hAnsi="Cambria Math"/>
                       </w:rPr>
-                      <m:t>-75.36</m:t>
+                      <m:t>-0.74</m:t>
                     </m:r>
                   </m:num>
                   <m:den>
@@ -7380,7 +8118,7 @@
                       <w:rPr>
                         <w:rFonts w:ascii="Cambria Math" w:hAnsi="Cambria Math"/>
                       </w:rPr>
-                      <m:t>-99.94</m:t>
+                      <m:t>-0.98</m:t>
                     </m:r>
                   </m:den>
                 </m:f>
@@ -7415,7 +8153,6 @@
             <w:rPr>
               <w:rFonts w:ascii="Cambria Math" w:hAnsi="Cambria Math"/>
             </w:rPr>
-            <w:lastRenderedPageBreak/>
             <m:t>Since C is in</m:t>
           </m:r>
           <m:r>
@@ -7459,7 +8196,247 @@
     </w:p>
     <w:p>
       <w:r>
-        <w:t xml:space="preserve">Difference = </w:t>
+        <w:rPr>
+          <w:u w:val="single"/>
+        </w:rPr>
+        <w:t xml:space="preserve">Force </w:t>
+      </w:r>
+      <m:oMath>
+        <m:sSub>
+          <m:sSubPr>
+            <m:ctrlPr>
+              <w:rPr>
+                <w:rFonts w:ascii="Cambria Math" w:eastAsiaTheme="minorEastAsia" w:hAnsi="Cambria Math"/>
+                <w:i/>
+                <w:u w:val="single"/>
+              </w:rPr>
+            </m:ctrlPr>
+          </m:sSubPr>
+          <m:e>
+            <m:r>
+              <w:rPr>
+                <w:rFonts w:ascii="Cambria Math" w:eastAsiaTheme="minorEastAsia" w:hAnsi="Cambria Math"/>
+                <w:u w:val="single"/>
+              </w:rPr>
+              <m:t>C</m:t>
+            </m:r>
+          </m:e>
+          <m:sub>
+            <m:r>
+              <w:rPr>
+                <w:rFonts w:ascii="Cambria Math" w:eastAsiaTheme="minorEastAsia" w:hAnsi="Cambria Math"/>
+                <w:u w:val="single"/>
+              </w:rPr>
+              <m:t>EXP</m:t>
+            </m:r>
+          </m:sub>
+        </m:sSub>
+      </m:oMath>
+      <w:r>
+        <w:t>: (With 122g)</w:t>
+      </w:r>
+    </w:p>
+    <w:p>
+      <w:pPr>
+        <w:pStyle w:val="NormalWeb"/>
+        <w:spacing w:before="0" w:beforeAutospacing="0" w:after="0" w:afterAutospacing="0"/>
+        <w:rPr>
+          <w:iCs/>
+        </w:rPr>
+      </w:pPr>
+      <m:oMathPara>
+        <m:oMath>
+          <m:sSub>
+            <m:sSubPr>
+              <m:ctrlPr>
+                <w:rPr>
+                  <w:rFonts w:ascii="Cambria Math" w:hAnsi="Cambria Math"/>
+                  <w:i/>
+                </w:rPr>
+              </m:ctrlPr>
+            </m:sSubPr>
+            <m:e>
+              <m:r>
+                <w:rPr>
+                  <w:rFonts w:ascii="Cambria Math" w:hAnsi="Cambria Math"/>
+                </w:rPr>
+                <m:t>F</m:t>
+              </m:r>
+            </m:e>
+            <m:sub>
+              <m:r>
+                <w:rPr>
+                  <w:rFonts w:ascii="Cambria Math" w:hAnsi="Cambria Math"/>
+                </w:rPr>
+                <m:t>C</m:t>
+              </m:r>
+            </m:sub>
+          </m:sSub>
+          <m:r>
+            <w:rPr>
+              <w:rFonts w:ascii="Cambria Math" w:hAnsi="Cambria Math"/>
+            </w:rPr>
+            <m:t>=</m:t>
+          </m:r>
+          <m:d>
+            <m:dPr>
+              <m:ctrlPr>
+                <w:rPr>
+                  <w:rFonts w:ascii="Cambria Math" w:hAnsi="Cambria Math"/>
+                  <w:i/>
+                </w:rPr>
+              </m:ctrlPr>
+            </m:dPr>
+            <m:e>
+              <m:f>
+                <m:fPr>
+                  <m:ctrlPr>
+                    <w:rPr>
+                      <w:rFonts w:ascii="Cambria Math" w:hAnsi="Cambria Math"/>
+                      <w:i/>
+                    </w:rPr>
+                  </m:ctrlPr>
+                </m:fPr>
+                <m:num>
+                  <m:r>
+                    <w:rPr>
+                      <w:rFonts w:ascii="Cambria Math" w:hAnsi="Cambria Math"/>
+                    </w:rPr>
+                    <m:t>122</m:t>
+                  </m:r>
+                </m:num>
+                <m:den>
+                  <m:r>
+                    <w:rPr>
+                      <w:rFonts w:ascii="Cambria Math" w:hAnsi="Cambria Math"/>
+                    </w:rPr>
+                    <m:t>1000</m:t>
+                  </m:r>
+                </m:den>
+              </m:f>
+            </m:e>
+          </m:d>
+          <m:r>
+            <w:rPr>
+              <w:rFonts w:ascii="Cambria Math" w:hAnsi="Cambria Math"/>
+            </w:rPr>
+            <m:t>*9.8=</m:t>
+          </m:r>
+          <m:r>
+            <m:rPr>
+              <m:sty m:val="p"/>
+            </m:rPr>
+            <w:rPr>
+              <w:rFonts w:ascii="Cambria Math" w:hAnsi="Cambria Math"/>
+            </w:rPr>
+            <m:t>1.1956N</m:t>
+          </m:r>
+        </m:oMath>
+      </m:oMathPara>
+    </w:p>
+    <w:p>
+      <w:pPr>
+        <w:pStyle w:val="NormalWeb"/>
+        <w:spacing w:before="0" w:beforeAutospacing="0" w:after="0" w:afterAutospacing="0"/>
+        <w:rPr>
+          <w:iCs/>
+        </w:rPr>
+      </w:pPr>
+      <w:r>
+        <w:rPr>
+          <w:iCs/>
+        </w:rPr>
+        <w:t>With 20g 30</w:t>
+      </w:r>
+      <m:oMath>
+        <m:r>
+          <w:rPr>
+            <w:rFonts w:ascii="Cambria Math" w:hAnsi="Cambria Math"/>
+          </w:rPr>
+          <m:t>°</m:t>
+        </m:r>
+      </m:oMath>
+      <w:r>
+        <w:rPr>
+          <w:iCs/>
+        </w:rPr>
+        <w:t>until the ring quit being in the central:</w:t>
+      </w:r>
+    </w:p>
+    <w:p>
+      <w:pPr>
+        <w:pStyle w:val="NormalWeb"/>
+        <w:spacing w:before="0" w:beforeAutospacing="0" w:after="0" w:afterAutospacing="0"/>
+        <w:rPr>
+          <w:iCs/>
+        </w:rPr>
+      </w:pPr>
+      <m:oMathPara>
+        <m:oMath>
+          <m:r>
+            <w:rPr>
+              <w:rFonts w:ascii="Cambria Math" w:hAnsi="Cambria Math"/>
+            </w:rPr>
+            <m:t>F=</m:t>
+          </m:r>
+          <m:d>
+            <m:dPr>
+              <m:ctrlPr>
+                <w:rPr>
+                  <w:rFonts w:ascii="Cambria Math" w:hAnsi="Cambria Math"/>
+                  <w:i/>
+                  <w:iCs/>
+                </w:rPr>
+              </m:ctrlPr>
+            </m:dPr>
+            <m:e>
+              <m:f>
+                <m:fPr>
+                  <m:ctrlPr>
+                    <w:rPr>
+                      <w:rFonts w:ascii="Cambria Math" w:hAnsi="Cambria Math"/>
+                      <w:i/>
+                      <w:iCs/>
+                    </w:rPr>
+                  </m:ctrlPr>
+                </m:fPr>
+                <m:num>
+                  <m:r>
+                    <w:rPr>
+                      <w:rFonts w:ascii="Cambria Math" w:hAnsi="Cambria Math"/>
+                    </w:rPr>
+                    <m:t>20</m:t>
+                  </m:r>
+                </m:num>
+                <m:den>
+                  <m:r>
+                    <w:rPr>
+                      <w:rFonts w:ascii="Cambria Math" w:hAnsi="Cambria Math"/>
+                    </w:rPr>
+                    <m:t>1000</m:t>
+                  </m:r>
+                </m:den>
+              </m:f>
+            </m:e>
+          </m:d>
+          <m:r>
+            <w:rPr>
+              <w:rFonts w:ascii="Cambria Math" w:hAnsi="Cambria Math"/>
+            </w:rPr>
+            <m:t>*9.8=0.196 N</m:t>
+          </m:r>
+        </m:oMath>
+      </m:oMathPara>
+    </w:p>
+    <w:p>
+      <w:r>
+        <w:rPr>
+          <w:u w:val="single"/>
+        </w:rPr>
+        <w:t xml:space="preserve">Difference </w:t>
+      </w:r>
+      <w:r>
+        <w:t xml:space="preserve">= </w:t>
       </w:r>
       <m:oMath>
         <m:sSub>
@@ -7524,13 +8501,19 @@
           <w:rPr>
             <w:rFonts w:ascii="Cambria Math" w:eastAsiaTheme="minorEastAsia" w:hAnsi="Cambria Math"/>
           </w:rPr>
-          <m:t>=125.17-122=3.17</m:t>
+          <m:t>=1.2267N-1.1956N=0.04N</m:t>
         </m:r>
       </m:oMath>
     </w:p>
     <w:p>
       <w:r>
-        <w:t xml:space="preserve">% Difference </w:t>
+        <w:rPr>
+          <w:u w:val="single"/>
+        </w:rPr>
+        <w:t>% Difference</w:t>
+      </w:r>
+      <w:r>
+        <w:t xml:space="preserve"> </w:t>
       </w:r>
       <m:oMath>
         <m:r>
@@ -7741,7 +8724,7 @@
               <w:rPr>
                 <w:rFonts w:ascii="Cambria Math" w:hAnsi="Cambria Math"/>
               </w:rPr>
-              <m:t>3.17</m:t>
+              <m:t>0.04</m:t>
             </m:r>
           </m:num>
           <m:den>
@@ -7775,7 +8758,7 @@
               <w:rPr>
                 <w:rFonts w:ascii="Cambria Math" w:hAnsi="Cambria Math"/>
               </w:rPr>
-              <m:t>(125.17+122)</m:t>
+              <m:t>(1.2267+1.1956)</m:t>
             </m:r>
           </m:den>
         </m:f>
@@ -7789,21 +8772,13 @@
           <w:rPr>
             <w:rFonts w:ascii="Cambria Math" w:hAnsi="Cambria Math"/>
           </w:rPr>
-          <m:t>=2.57%</m:t>
+          <m:t>=3.03%</m:t>
         </m:r>
       </m:oMath>
     </w:p>
     <w:p>
       <w:pPr>
         <w:rPr>
-          <w:sz w:val="28"/>
-          <w:szCs w:val="28"/>
-        </w:rPr>
-      </w:pPr>
-    </w:p>
-    <w:p>
-      <w:pPr>
-        <w:rPr>
           <w:b/>
           <w:bCs/>
           <w:sz w:val="28"/>
@@ -7820,7 +8795,6 @@
         <w:t>Summary and Analysis Questions</w:t>
       </w:r>
     </w:p>
-    <w:p/>
     <w:p>
       <w:pPr>
         <w:pStyle w:val="NormalWeb"/>
@@ -7899,7 +8873,23 @@
           <w:color w:val="404040" w:themeColor="text1" w:themeTint="BF"/>
           <w:kern w:val="24"/>
         </w:rPr>
-        <w:t xml:space="preserve">The pulleys in the experiment are considered a systematic error because they will consistently behave the same each measurement and depend on exactly what angle they were placed at and how much weight was added. A slight degree off or slightly too much weight will consistently skew the experiment’s results. </w:t>
+        <w:t>The pulleys in the experiment are considered a systematic error because they will consistently behave the same</w:t>
+      </w:r>
+      <w:r>
+        <w:rPr>
+          <w:rFonts w:eastAsiaTheme="minorEastAsia"/>
+          <w:color w:val="404040" w:themeColor="text1" w:themeTint="BF"/>
+          <w:kern w:val="24"/>
+        </w:rPr>
+        <w:t xml:space="preserve"> during</w:t>
+      </w:r>
+      <w:r>
+        <w:rPr>
+          <w:rFonts w:eastAsiaTheme="minorEastAsia"/>
+          <w:color w:val="404040" w:themeColor="text1" w:themeTint="BF"/>
+          <w:kern w:val="24"/>
+        </w:rPr>
+        <w:t xml:space="preserve"> each measurement and depend on exactly what angle they were placed at and how much weight was added. A slight degree off or slightly too much weight will consistently skew the experiment’s results. </w:t>
       </w:r>
     </w:p>
     <w:p>
@@ -7940,12 +8930,19 @@
         </w:rPr>
         <w:t>An improperly leveled table will cause the lower pulleys to pull harder than the higher pulleys which will give them a higher magnitude than what is recorded and the inner ring will not be centered.</w:t>
       </w:r>
+      <w:r>
+        <w:rPr>
+          <w:rFonts w:eastAsiaTheme="minorEastAsia"/>
+          <w:color w:val="404040" w:themeColor="text1" w:themeTint="BF"/>
+          <w:kern w:val="24"/>
+        </w:rPr>
+        <w:t xml:space="preserve"> Our results would be inconsistent with our calculations because our calculations wouldn’t have factored in an unleveled table.</w:t>
+      </w:r>
     </w:p>
     <w:p>
       <w:pPr>
         <w:pStyle w:val="NormalWeb"/>
         <w:spacing w:before="200" w:beforeAutospacing="0" w:after="0" w:afterAutospacing="0"/>
-        <w:ind w:left="720" w:hanging="720"/>
         <w:rPr>
           <w:rFonts w:eastAsiaTheme="minorEastAsia"/>
           <w:color w:val="404040" w:themeColor="text1" w:themeTint="BF"/>
@@ -7958,6 +8955,7 @@
           <w:color w:val="404040" w:themeColor="text1" w:themeTint="BF"/>
           <w:kern w:val="24"/>
         </w:rPr>
+        <w:lastRenderedPageBreak/>
         <w:t>2.</w:t>
       </w:r>
       <w:r>
@@ -7974,7 +8972,6 @@
       <w:pPr>
         <w:pStyle w:val="NormalWeb"/>
         <w:spacing w:before="200" w:beforeAutospacing="0" w:after="0" w:afterAutospacing="0"/>
-        <w:ind w:firstLine="720"/>
         <w:rPr>
           <w:rFonts w:eastAsiaTheme="minorEastAsia"/>
           <w:color w:val="404040" w:themeColor="text1" w:themeTint="BF"/>
@@ -7987,6 +8984,7 @@
           <w:color w:val="404040" w:themeColor="text1" w:themeTint="BF"/>
           <w:kern w:val="24"/>
         </w:rPr>
+        <w:tab/>
         <w:t xml:space="preserve">Changing the magnitude and direction of vectors A and B in the spreadsheet dramatically changes the calculated magnitude and direction of vector C. For example, just varying the magnitude or direction alone of vector A by 10 grams or 10 degrees respectively, changes both the calculated values for vector C by over 20 grams and 5 degrees. </w:t>
       </w:r>
     </w:p>
@@ -7995,33 +8993,18 @@
         <w:pStyle w:val="NormalWeb"/>
         <w:spacing w:before="200" w:beforeAutospacing="0" w:after="0" w:afterAutospacing="0"/>
         <w:rPr>
-          <w:sz w:val="16"/>
-          <w:szCs w:val="16"/>
-        </w:rPr>
-      </w:pPr>
-      <w:r>
-        <w:rPr>
           <w:rFonts w:eastAsiaTheme="minorEastAsia"/>
           <w:color w:val="404040" w:themeColor="text1" w:themeTint="BF"/>
           <w:kern w:val="24"/>
         </w:rPr>
-        <w:t>3.</w:t>
-      </w:r>
+      </w:pPr>
       <w:r>
         <w:rPr>
           <w:rFonts w:eastAsiaTheme="minorEastAsia"/>
           <w:color w:val="404040" w:themeColor="text1" w:themeTint="BF"/>
           <w:kern w:val="24"/>
         </w:rPr>
-        <w:tab/>
-        <w:t>Check calculations using a Spread Sheet</w:t>
-      </w:r>
-      <w:r>
-        <w:rPr>
-          <w:sz w:val="16"/>
-          <w:szCs w:val="16"/>
-        </w:rPr>
-        <w:br/>
+        <w:t>3.</w:t>
       </w:r>
       <w:r>
         <w:rPr>
@@ -8030,15 +9013,56 @@
           <w:kern w:val="24"/>
         </w:rPr>
         <w:tab/>
-        <w:t>For procedure 1, our calculations are consistent with the calculations for the magnitude and angle of the C vector and the % difference in the spreadsheet, the values vary slightly from our experimental values by a difference of -2 grams and -3 degrees. Our procedure 2 calculations are also consistent with the spreadsheet calculations for the magnitude and angle of the new C vector while varying from the experimental values by -3 grams and -2 degrees.</w:t>
+        <w:t>Check calculations using a Spread Sheet</w:t>
       </w:r>
     </w:p>
     <w:p>
+      <w:pPr>
+        <w:pStyle w:val="NormalWeb"/>
+        <w:spacing w:before="200" w:beforeAutospacing="0" w:after="0" w:afterAutospacing="0"/>
+        <w:rPr>
+          <w:sz w:val="16"/>
+          <w:szCs w:val="16"/>
+        </w:rPr>
+      </w:pPr>
+      <w:r>
+        <w:rPr>
+          <w:rFonts w:eastAsiaTheme="minorEastAsia"/>
+          <w:color w:val="404040" w:themeColor="text1" w:themeTint="BF"/>
+          <w:kern w:val="24"/>
+        </w:rPr>
+        <w:tab/>
+        <w:t>For procedure 1, our calculations are consistent with the calculations for the magnitude and angle of the C vector and the % difference in the spreadsheet, the values vary slightly from our experimental values by a difference of -</w:t>
+      </w:r>
+      <w:r>
+        <w:rPr>
+          <w:rFonts w:eastAsiaTheme="minorEastAsia"/>
+          <w:color w:val="404040" w:themeColor="text1" w:themeTint="BF"/>
+          <w:kern w:val="24"/>
+        </w:rPr>
+        <w:t>0.0</w:t>
+      </w:r>
+      <w:r>
+        <w:rPr>
+          <w:rFonts w:eastAsiaTheme="minorEastAsia"/>
+          <w:color w:val="404040" w:themeColor="text1" w:themeTint="BF"/>
+          <w:kern w:val="24"/>
+        </w:rPr>
+        <w:t>6 newtons and 1.87 degrees. Our procedure 2 calculations are also consistent with the spreadsheet calculations for the magnitude and angle of the new C vector while varying from the experimental values by -0.04 newtons and -2 degrees.</w:t>
+      </w:r>
+    </w:p>
+    <w:p>
       <w:r>
         <w:tab/>
       </w:r>
     </w:p>
     <w:p/>
+    <w:p>
+      <w:pPr>
+        <w:pStyle w:val="NormalWeb"/>
+        <w:spacing w:before="200" w:beforeAutospacing="0" w:after="0" w:afterAutospacing="0"/>
+      </w:pPr>
+    </w:p>
     <w:sectPr>
       <w:pgSz w:w="12240" w:h="15840"/>
       <w:pgMar w:top="1440" w:right="1440" w:bottom="1440" w:left="1440" w:header="720" w:footer="720" w:gutter="0"/>
@@ -8546,7 +9570,7 @@
   <w:style w:type="paragraph" w:default="1" w:styleId="Normal">
     <w:name w:val="Normal"/>
     <w:qFormat/>
-    <w:rsid w:val="001C1761"/>
+    <w:rsid w:val="0006401F"/>
     <w:pPr>
       <w:spacing w:after="0" w:line="240" w:lineRule="auto"/>
     </w:pPr>
@@ -8820,7 +9844,7 @@
                 <c:formatCode>0</c:formatCode>
                 <c:ptCount val="2"/>
                 <c:pt idx="0">
-                  <c:v>-134.98539803417327</c:v>
+                  <c:v>1.47</c:v>
                 </c:pt>
                 <c:pt idx="1">
                   <c:v>0</c:v>
@@ -8835,7 +9859,7 @@
                 <c:formatCode>0</c:formatCode>
                 <c:ptCount val="2"/>
                 <c:pt idx="0">
-                  <c:v>160.86933305498539</c:v>
+                  <c:v>0</c:v>
                 </c:pt>
                 <c:pt idx="1">
                   <c:v>0</c:v>
@@ -8846,7 +9870,7 @@
           <c:smooth val="0"/>
           <c:extLst>
             <c:ext xmlns:c16="http://schemas.microsoft.com/office/drawing/2014/chart" uri="{C3380CC4-5D6E-409C-BE32-E72D297353CC}">
-              <c16:uniqueId val="{00000000-BC69-44B9-8C1B-432479B78D18}"/>
+              <c16:uniqueId val="{00000000-3E06-4463-BB06-013DE1CEA396}"/>
             </c:ext>
           </c:extLst>
         </c:ser>
@@ -8916,7 +9940,7 @@
                 <c:formatCode>0</c:formatCode>
                 <c:ptCount val="2"/>
                 <c:pt idx="0">
-                  <c:v>-134.98539803417327</c:v>
+                  <c:v>1.47</c:v>
                 </c:pt>
                 <c:pt idx="1">
                   <c:v>0</c:v>
@@ -8931,7 +9955,7 @@
                 <c:formatCode>0</c:formatCode>
                 <c:ptCount val="2"/>
                 <c:pt idx="0">
-                  <c:v>160.86933305498539</c:v>
+                  <c:v>0</c:v>
                 </c:pt>
                 <c:pt idx="1">
                   <c:v>0</c:v>
@@ -8942,7 +9966,7 @@
           <c:smooth val="0"/>
           <c:extLst>
             <c:ext xmlns:c16="http://schemas.microsoft.com/office/drawing/2014/chart" uri="{C3380CC4-5D6E-409C-BE32-E72D297353CC}">
-              <c16:uniqueId val="{00000001-BC69-44B9-8C1B-432479B78D18}"/>
+              <c16:uniqueId val="{00000001-3E06-4463-BB06-013DE1CEA396}"/>
             </c:ext>
           </c:extLst>
         </c:ser>
@@ -9210,7 +10234,7 @@
                 <c:formatCode>0</c:formatCode>
                 <c:ptCount val="2"/>
                 <c:pt idx="0">
-                  <c:v>234.92315519647701</c:v>
+                  <c:v>1.2006454858104477E-16</c:v>
                 </c:pt>
                 <c:pt idx="1">
                   <c:v>0</c:v>
@@ -9225,7 +10249,7 @@
                 <c:formatCode>0</c:formatCode>
                 <c:ptCount val="2"/>
                 <c:pt idx="0">
-                  <c:v>-85.505035831417359</c:v>
+                  <c:v>1.9600000000000002</c:v>
                 </c:pt>
                 <c:pt idx="1">
                   <c:v>0</c:v>
@@ -9236,7 +10260,7 @@
           <c:smooth val="0"/>
           <c:extLst>
             <c:ext xmlns:c16="http://schemas.microsoft.com/office/drawing/2014/chart" uri="{C3380CC4-5D6E-409C-BE32-E72D297353CC}">
-              <c16:uniqueId val="{00000000-645F-49F3-9BE8-C507442553B1}"/>
+              <c16:uniqueId val="{00000000-B225-4E20-8E45-E2C1CA7DB38E}"/>
             </c:ext>
           </c:extLst>
         </c:ser>
@@ -9504,7 +10528,7 @@
                 <c:formatCode>0</c:formatCode>
                 <c:ptCount val="2"/>
                 <c:pt idx="0">
-                  <c:v>-99.93775716230374</c:v>
+                  <c:v>-1.4700000000000002</c:v>
                 </c:pt>
                 <c:pt idx="1">
                   <c:v>0</c:v>
@@ -9519,7 +10543,7 @@
                 <c:formatCode>0</c:formatCode>
                 <c:ptCount val="2"/>
                 <c:pt idx="0">
-                  <c:v>-75.36429722356803</c:v>
+                  <c:v>-1.9600000000000002</c:v>
                 </c:pt>
                 <c:pt idx="1">
                   <c:v>0</c:v>
@@ -9530,7 +10554,7 @@
           <c:smooth val="0"/>
           <c:extLst>
             <c:ext xmlns:c16="http://schemas.microsoft.com/office/drawing/2014/chart" uri="{C3380CC4-5D6E-409C-BE32-E72D297353CC}">
-              <c16:uniqueId val="{00000000-85F4-47FA-9A9F-59A4972A1316}"/>
+              <c16:uniqueId val="{00000000-0C7C-483F-9287-B4CE55FB7207}"/>
             </c:ext>
           </c:extLst>
         </c:ser>
@@ -9798,7 +10822,7 @@
                 <c:formatCode>0</c:formatCode>
                 <c:ptCount val="2"/>
                 <c:pt idx="0">
-                  <c:v>-99.93775716230374</c:v>
+                  <c:v>-1.4700000000000002</c:v>
                 </c:pt>
                 <c:pt idx="1">
                   <c:v>0</c:v>
@@ -9813,7 +10837,7 @@
                 <c:formatCode>0</c:formatCode>
                 <c:ptCount val="2"/>
                 <c:pt idx="0">
-                  <c:v>-75.36429722356803</c:v>
+                  <c:v>-1.9600000000000002</c:v>
                 </c:pt>
                 <c:pt idx="1">
                   <c:v>0</c:v>
@@ -9824,7 +10848,7 @@
           <c:smooth val="0"/>
           <c:extLst>
             <c:ext xmlns:c16="http://schemas.microsoft.com/office/drawing/2014/chart" uri="{C3380CC4-5D6E-409C-BE32-E72D297353CC}">
-              <c16:uniqueId val="{00000000-3077-4DAE-9DB0-160C1765D16F}"/>
+              <c16:uniqueId val="{00000000-1C51-4A6A-BF1E-8FC556560E4D}"/>
             </c:ext>
           </c:extLst>
         </c:ser>
@@ -9899,7 +10923,7 @@
                 <c:formatCode>0</c:formatCode>
                 <c:ptCount val="2"/>
                 <c:pt idx="0">
-                  <c:v>-134.98539803417327</c:v>
+                  <c:v>1.47</c:v>
                 </c:pt>
                 <c:pt idx="1">
                   <c:v>0</c:v>
@@ -9914,7 +10938,7 @@
                 <c:formatCode>0</c:formatCode>
                 <c:ptCount val="2"/>
                 <c:pt idx="0">
-                  <c:v>160.86933305498539</c:v>
+                  <c:v>0</c:v>
                 </c:pt>
                 <c:pt idx="1">
                   <c:v>0</c:v>
@@ -9925,7 +10949,7 @@
           <c:smooth val="0"/>
           <c:extLst>
             <c:ext xmlns:c16="http://schemas.microsoft.com/office/drawing/2014/chart" uri="{C3380CC4-5D6E-409C-BE32-E72D297353CC}">
-              <c16:uniqueId val="{00000001-3077-4DAE-9DB0-160C1765D16F}"/>
+              <c16:uniqueId val="{00000001-1C51-4A6A-BF1E-8FC556560E4D}"/>
             </c:ext>
           </c:extLst>
         </c:ser>
@@ -10000,7 +11024,7 @@
                 <c:formatCode>0</c:formatCode>
                 <c:ptCount val="2"/>
                 <c:pt idx="0">
-                  <c:v>234.92315519647701</c:v>
+                  <c:v>1.2006454858104477E-16</c:v>
                 </c:pt>
                 <c:pt idx="1">
                   <c:v>0</c:v>
@@ -10015,7 +11039,7 @@
                 <c:formatCode>0</c:formatCode>
                 <c:ptCount val="2"/>
                 <c:pt idx="0">
-                  <c:v>-85.505035831417359</c:v>
+                  <c:v>1.9600000000000002</c:v>
                 </c:pt>
                 <c:pt idx="1">
                   <c:v>0</c:v>
@@ -10026,7 +11050,7 @@
           <c:smooth val="0"/>
           <c:extLst>
             <c:ext xmlns:c16="http://schemas.microsoft.com/office/drawing/2014/chart" uri="{C3380CC4-5D6E-409C-BE32-E72D297353CC}">
-              <c16:uniqueId val="{00000002-3077-4DAE-9DB0-160C1765D16F}"/>
+              <c16:uniqueId val="{00000002-1C51-4A6A-BF1E-8FC556560E4D}"/>
             </c:ext>
           </c:extLst>
         </c:ser>
@@ -10294,7 +11318,7 @@
                 <c:formatCode>0</c:formatCode>
                 <c:ptCount val="2"/>
                 <c:pt idx="0">
-                  <c:v>-134.98539803417327</c:v>
+                  <c:v>-1.32</c:v>
                 </c:pt>
                 <c:pt idx="1">
                   <c:v>0</c:v>
@@ -10309,7 +11333,7 @@
                 <c:formatCode>0</c:formatCode>
                 <c:ptCount val="2"/>
                 <c:pt idx="0">
-                  <c:v>160.86933305498539</c:v>
+                  <c:v>1.58</c:v>
                 </c:pt>
                 <c:pt idx="1">
                   <c:v>0</c:v>
@@ -10320,7 +11344,7 @@
           <c:smooth val="0"/>
           <c:extLst>
             <c:ext xmlns:c16="http://schemas.microsoft.com/office/drawing/2014/chart" uri="{C3380CC4-5D6E-409C-BE32-E72D297353CC}">
-              <c16:uniqueId val="{00000000-078D-433B-BAC5-17B4F544593A}"/>
+              <c16:uniqueId val="{00000000-4D8F-4090-86F9-F132D545A66F}"/>
             </c:ext>
           </c:extLst>
         </c:ser>
@@ -10390,7 +11414,7 @@
                 <c:formatCode>0</c:formatCode>
                 <c:ptCount val="2"/>
                 <c:pt idx="0">
-                  <c:v>-134.98539803417327</c:v>
+                  <c:v>-1.32</c:v>
                 </c:pt>
                 <c:pt idx="1">
                   <c:v>0</c:v>
@@ -10405,7 +11429,7 @@
                 <c:formatCode>0</c:formatCode>
                 <c:ptCount val="2"/>
                 <c:pt idx="0">
-                  <c:v>160.86933305498539</c:v>
+                  <c:v>1.58</c:v>
                 </c:pt>
                 <c:pt idx="1">
                   <c:v>0</c:v>
@@ -10416,7 +11440,7 @@
           <c:smooth val="0"/>
           <c:extLst>
             <c:ext xmlns:c16="http://schemas.microsoft.com/office/drawing/2014/chart" uri="{C3380CC4-5D6E-409C-BE32-E72D297353CC}">
-              <c16:uniqueId val="{00000001-078D-433B-BAC5-17B4F544593A}"/>
+              <c16:uniqueId val="{00000001-4D8F-4090-86F9-F132D545A66F}"/>
             </c:ext>
           </c:extLst>
         </c:ser>
@@ -10684,7 +11708,7 @@
                 <c:formatCode>0</c:formatCode>
                 <c:ptCount val="2"/>
                 <c:pt idx="0">
-                  <c:v>234.92315519647701</c:v>
+                  <c:v>2.2999999999999998</c:v>
                 </c:pt>
                 <c:pt idx="1">
                   <c:v>0</c:v>
@@ -10699,7 +11723,7 @@
                 <c:formatCode>0</c:formatCode>
                 <c:ptCount val="2"/>
                 <c:pt idx="0">
-                  <c:v>-85.505035831417359</c:v>
+                  <c:v>-0.84</c:v>
                 </c:pt>
                 <c:pt idx="1">
                   <c:v>0</c:v>
@@ -10710,7 +11734,7 @@
           <c:smooth val="0"/>
           <c:extLst>
             <c:ext xmlns:c16="http://schemas.microsoft.com/office/drawing/2014/chart" uri="{C3380CC4-5D6E-409C-BE32-E72D297353CC}">
-              <c16:uniqueId val="{00000000-0C74-4ED0-9D85-96BB06CE38E0}"/>
+              <c16:uniqueId val="{00000000-16C3-46D5-BD48-208E26A18B93}"/>
             </c:ext>
           </c:extLst>
         </c:ser>
@@ -10978,7 +12002,7 @@
                 <c:formatCode>0</c:formatCode>
                 <c:ptCount val="2"/>
                 <c:pt idx="0">
-                  <c:v>-99.93775716230374</c:v>
+                  <c:v>-0.98</c:v>
                 </c:pt>
                 <c:pt idx="1">
                   <c:v>0</c:v>
@@ -10993,7 +12017,7 @@
                 <c:formatCode>0</c:formatCode>
                 <c:ptCount val="2"/>
                 <c:pt idx="0">
-                  <c:v>-75.36429722356803</c:v>
+                  <c:v>-0.74</c:v>
                 </c:pt>
                 <c:pt idx="1">
                   <c:v>0</c:v>
@@ -11004,7 +12028,7 @@
           <c:smooth val="0"/>
           <c:extLst>
             <c:ext xmlns:c16="http://schemas.microsoft.com/office/drawing/2014/chart" uri="{C3380CC4-5D6E-409C-BE32-E72D297353CC}">
-              <c16:uniqueId val="{00000000-637E-46D5-A8CA-482920FDE388}"/>
+              <c16:uniqueId val="{00000000-C908-4982-98CA-E70395D72D8C}"/>
             </c:ext>
           </c:extLst>
         </c:ser>
@@ -11272,7 +12296,7 @@
                 <c:formatCode>0</c:formatCode>
                 <c:ptCount val="2"/>
                 <c:pt idx="0">
-                  <c:v>-99.93775716230374</c:v>
+                  <c:v>-0.98</c:v>
                 </c:pt>
                 <c:pt idx="1">
                   <c:v>0</c:v>
@@ -11287,7 +12311,7 @@
                 <c:formatCode>0</c:formatCode>
                 <c:ptCount val="2"/>
                 <c:pt idx="0">
-                  <c:v>-75.36429722356803</c:v>
+                  <c:v>-0.74</c:v>
                 </c:pt>
                 <c:pt idx="1">
                   <c:v>0</c:v>
@@ -11298,7 +12322,7 @@
           <c:smooth val="0"/>
           <c:extLst>
             <c:ext xmlns:c16="http://schemas.microsoft.com/office/drawing/2014/chart" uri="{C3380CC4-5D6E-409C-BE32-E72D297353CC}">
-              <c16:uniqueId val="{00000000-EB58-40A6-8020-CB2474002001}"/>
+              <c16:uniqueId val="{00000000-26A2-47E6-A6EE-CE4373E654E0}"/>
             </c:ext>
           </c:extLst>
         </c:ser>
@@ -11373,7 +12397,7 @@
                 <c:formatCode>0</c:formatCode>
                 <c:ptCount val="2"/>
                 <c:pt idx="0">
-                  <c:v>-134.98539803417327</c:v>
+                  <c:v>-1.32</c:v>
                 </c:pt>
                 <c:pt idx="1">
                   <c:v>0</c:v>
@@ -11388,7 +12412,7 @@
                 <c:formatCode>0</c:formatCode>
                 <c:ptCount val="2"/>
                 <c:pt idx="0">
-                  <c:v>160.86933305498539</c:v>
+                  <c:v>1.58</c:v>
                 </c:pt>
                 <c:pt idx="1">
                   <c:v>0</c:v>
@@ -11399,7 +12423,7 @@
           <c:smooth val="0"/>
           <c:extLst>
             <c:ext xmlns:c16="http://schemas.microsoft.com/office/drawing/2014/chart" uri="{C3380CC4-5D6E-409C-BE32-E72D297353CC}">
-              <c16:uniqueId val="{00000001-EB58-40A6-8020-CB2474002001}"/>
+              <c16:uniqueId val="{00000001-26A2-47E6-A6EE-CE4373E654E0}"/>
             </c:ext>
           </c:extLst>
         </c:ser>
@@ -11474,7 +12498,7 @@
                 <c:formatCode>0</c:formatCode>
                 <c:ptCount val="2"/>
                 <c:pt idx="0">
-                  <c:v>234.92315519647701</c:v>
+                  <c:v>2.2999999999999998</c:v>
                 </c:pt>
                 <c:pt idx="1">
                   <c:v>0</c:v>
@@ -11489,7 +12513,7 @@
                 <c:formatCode>0</c:formatCode>
                 <c:ptCount val="2"/>
                 <c:pt idx="0">
-                  <c:v>-85.505035831417359</c:v>
+                  <c:v>-0.84</c:v>
                 </c:pt>
                 <c:pt idx="1">
                   <c:v>0</c:v>
@@ -11500,7 +12524,7 @@
           <c:smooth val="0"/>
           <c:extLst>
             <c:ext xmlns:c16="http://schemas.microsoft.com/office/drawing/2014/chart" uri="{C3380CC4-5D6E-409C-BE32-E72D297353CC}">
-              <c16:uniqueId val="{00000002-EB58-40A6-8020-CB2474002001}"/>
+              <c16:uniqueId val="{00000002-26A2-47E6-A6EE-CE4373E654E0}"/>
             </c:ext>
           </c:extLst>
         </c:ser>

</xml_diff>